<commit_message>
Taller 03: URLs de evidencia en el informe y casos contrastantes documentados
</commit_message>
<xml_diff>
--- a/SI084-S03-TALLER-VargasGutierrez.docx
+++ b/SI084-S03-TALLER-VargasGutierrez.docx
@@ -2504,6 +2504,14 @@
       </w:r>
       <w:bookmarkEnd w:id="25"/>
     </w:p>
+    <w:p>
+      <w:pPr>
+        <w:pStyle w:val="FirstParagraph"/>
+      </w:pPr>
+      <w:r>
+        <w:t>Etiqueta del taller y evidencia en GitHub: https://github.com/AngelVargasGutierrez/SI-084-TALLER-03/tree/taller-03</w:t>
+      </w:r>
+    </w:p>
     <w:tbl>
       <w:tblPr>
         <w:tblStyle w:val="Table"/>
@@ -2617,7 +2625,7 @@
           </w:tcPr>
           <w:p>
             <w:r>
-              <w:t>Interfaz en https://127.0.0.1/, 186 134 NVT + CVE/SCAP/CERT sincronizados. Captura en Anexo A. URL GitHub: (pendiente de commit final).</w:t>
+              <w:t>Interfaz https://127.0.0.1/, 186 134 NVT + CVE/SCAP/CERT sincronizados. Captura: https://github.com/AngelVargasGutierrez/SI-084-TALLER-03/blob/taller-03/docs/evidencias/S03/11_greenbone_dashboard.png</w:t>
             </w:r>
           </w:p>
         </w:tc>
@@ -2659,7 +2667,6 @@
           </w:tcPr>
           <w:p>
             <w:r>
-              <w:lastRenderedPageBreak/>
               <w:t>Logrado</w:t>
             </w:r>
           </w:p>
@@ -2670,31 +2677,7 @@
           </w:tcPr>
           <w:p>
             <w:r>
-              <w:rPr>
-                <w:lang w:val="en-US"/>
-              </w:rPr>
-              <w:t xml:space="preserve">Configure -&gt; Risk Configuration -&gt; Classic Risk Formula (Likelihood x Impact, </w:t>
-            </w:r>
-            <w:proofErr w:type="spellStart"/>
-            <w:r>
-              <w:rPr>
-                <w:lang w:val="en-US"/>
-              </w:rPr>
-              <w:t>normalizado</w:t>
-            </w:r>
-            <w:proofErr w:type="spellEnd"/>
-            <w:r>
-              <w:rPr>
-                <w:lang w:val="en-US"/>
-              </w:rPr>
-              <w:t xml:space="preserve"> 0-10). </w:t>
-            </w:r>
-            <w:r>
-              <w:t xml:space="preserve">Definiciones en 30_papeles_trabajo/PT03_criterio_evaluacion.md. </w:t>
-            </w:r>
-            <w:r>
-              <w:lastRenderedPageBreak/>
-              <w:t>Captura en Anexo A.</w:t>
+              <w:t>Classic Risk Formula (Likelihood x Impact, 0-10) con definiciones operativas 1-5 y criterio de aceptacion (&lt;=6). Captura: https://github.com/AngelVargasGutierrez/SI-084-TALLER-03/blob/taller-03/docs/evidencias/S03/06_simplerisk_classic_formula.png · Papel de trabajo: https://github.com/AngelVargasGutierrez/SI-084-TALLER-03/blob/taller-03/30_papeles_trabajo/PT03_criterio_evaluacion.md</w:t>
             </w:r>
           </w:p>
         </w:tc>
@@ -2733,7 +2716,7 @@
           </w:tcPr>
           <w:p>
             <w:r>
-              <w:t>En proceso</w:t>
+              <w:t>Logrado</w:t>
             </w:r>
           </w:p>
         </w:tc>
@@ -2743,7 +2726,7 @@
           </w:tcPr>
           <w:p>
             <w:r>
-              <w:t>Tarea E03-Escaneo-si084-lab en ejecución sobre 4 hosts de audit_net; objetivos.txt ya generado. CSV/XML se adjuntan al cerrar el escaneo.</w:t>
+              <w:t>Tarea E03-Escaneo-si084-lab, Done, 107 resultados (61 tras filtro QoD). Reportes y objetivos: https://github.com/AngelVargasGutierrez/SI-084-TALLER-03/blob/taller-03/20_evidencia/E03_scan</w:t>
             </w:r>
           </w:p>
         </w:tc>
@@ -2781,7 +2764,7 @@
           </w:tcPr>
           <w:p>
             <w:r>
-              <w:t>Pendiente</w:t>
+              <w:t>Logrado</w:t>
             </w:r>
           </w:p>
         </w:tc>
@@ -2791,7 +2774,7 @@
           </w:tcPr>
           <w:p>
             <w:r>
-              <w:t>Se genera al ejecutar PT03_tecnico_a_riesgo.py sobre el reporte de Greenbone, una vez concluido el escaneo.</w:t>
+              <w:t>15 riesgos (min. 10 requerido). Registro: https://github.com/AngelVargasGutierrez/SI-084-TALLER-03/blob/taller-03/40_hallazgos/PT03_registro_riesgos.csv</w:t>
             </w:r>
           </w:p>
         </w:tc>
@@ -2829,7 +2812,7 @@
           </w:tcPr>
           <w:p>
             <w:r>
-              <w:t>Pendiente</w:t>
+              <w:t>Logrado</w:t>
             </w:r>
           </w:p>
         </w:tc>
@@ -2839,7 +2822,7 @@
           </w:tcPr>
           <w:p>
             <w:r>
-              <w:t>Se identifican sobre el registro de riesgos generado en el resultado 4.</w:t>
+              <w:t>CVSS 10.0/riesgo Medio (R-011, si084_dvwa) y CVSS bajo-nulo/riesgo Medio (R-006/001/012/007, si084_juiceshop). Detalle: https://github.com/AngelVargasGutierrez/SI-084-TALLER-03/blob/taller-03/30_papeles_trabajo/PT03_criterio_evaluacion.md</w:t>
             </w:r>
           </w:p>
         </w:tc>
@@ -2874,7 +2857,7 @@
           </w:tcPr>
           <w:p>
             <w:r>
-              <w:t>Pendiente</w:t>
+              <w:t>Logrado</w:t>
             </w:r>
           </w:p>
         </w:tc>
@@ -2884,10 +2867,7 @@
           </w:tcPr>
           <w:p>
             <w:r>
-              <w:t xml:space="preserve">Se cargan los 5 riesgos de mayor valor del </w:t>
-            </w:r>
-            <w:r>
-              <w:t>registro en Risk Management -&gt; Submit Risk.</w:t>
+              <w:t>5 riesgos (IDs 1001-1005) con plan de mitigacion y control ISO mapeado. Capturas: https://github.com/AngelVargasGutierrez/SI-084-TALLER-03/blob/taller-03/docs/evidencias/S03/09_simplerisk_riesgos_cargados.png y https://github.com/AngelVargasGutierrez/SI-084-TALLER-03/blob/taller-03/docs/evidencias/S03/10_simplerisk_mitigaciones.png</w:t>
             </w:r>
           </w:p>
         </w:tc>
@@ -2922,7 +2902,7 @@
           </w:tcPr>
           <w:p>
             <w:r>
-              <w:t>Pendiente</w:t>
+              <w:t>Logrado</w:t>
             </w:r>
           </w:p>
         </w:tc>
@@ -2932,7 +2912,7 @@
           </w:tcPr>
           <w:p>
             <w:r>
-              <w:t>30_papeles_trabajo/PT03_soa_extracto.md.</w:t>
+              <w:t>6 controles, uno excluido (A.7.4) con justificacion. https://github.com/AngelVargasGutierrez/SI-084-TALLER-03/blob/taller-03/30_papeles_trabajo/PT03_soa_extracto.md</w:t>
             </w:r>
           </w:p>
         </w:tc>
@@ -2967,7 +2947,7 @@
           </w:tcPr>
           <w:p>
             <w:r>
-              <w:t>Pendiente</w:t>
+              <w:t>Logrado</w:t>
             </w:r>
           </w:p>
         </w:tc>
@@ -2977,10 +2957,7 @@
           </w:tcPr>
           <w:p>
             <w:r>
-              <w:t>S</w:t>
-            </w:r>
-            <w:r>
-              <w:t>HA256SUMS_E03.txt + git log, tras consolidar toda la evidencia.</w:t>
+              <w:t>https://github.com/AngelVargasGutierrez/SI-084-TALLER-03/blob/taller-03/20_evidencia/SHA256SUMS_E03.txt · PR: https://github.com/AngelVargasGutierrez/SI-084-TALLER-03/pull/1 (fusionado a develop) · Tag: https://github.com/AngelVargasGutierrez/SI-084-TALLER-03/tree/taller-03</w:t>
             </w:r>
           </w:p>
         </w:tc>
@@ -3353,7 +3330,7 @@
         <w:ind w:left="720"/>
       </w:pPr>
       <w:r>
-        <w:t>Anexo A — Capturas de Greenbone (feeds sincronizados, tarea de escaneo) y SimpleRisk (Risk Configuration, dashboard). Carpeta docs/evidencias/S03</w:t>
+        <w:t>Anexo A — Capturas de Greenbone y SimpleRisk. https://github.com/AngelVargasGutierrez/SI-084-TALLER-03/blob/taller-03/docs/evidencias/S03</w:t>
       </w:r>
       <w:proofErr w:type="gramStart"/>
       <w:r>
@@ -3370,7 +3347,7 @@
         <w:pStyle w:val="FirstParagraph"/>
       </w:pPr>
       <w:r>
-        <w:t>Anexo B — reporte_greenbone.csv, reporte_greenbone.xml y PT03_registro_riesgos.csv completos.</w:t>
+        <w:t>Anexo B — Reportes de escaneo y registro de riesgos. https://github.com/AngelVargasGutierrez/SI-084-TALLER-03/blob/taller-03/20_evidencia/E03_scan y https://github.com/AngelVargasGutierrez/SI-084-TALLER-03/blob/taller-03/40_hallazgos/PT03_registro_riesgos.csv</w:t>
       </w:r>
     </w:p>
     <w:p>
@@ -3378,7 +3355,7 @@
         <w:pStyle w:val="FirstParagraph"/>
       </w:pPr>
       <w:r>
-        <w:t>Anexo C —</w:t>
+        <w:t>Anexo C — Extracto de SoA. https://github.com/AngelVargasGutierrez/SI-084-TALLER-03/blob/taller-03/30_papeles_trabajo/PT03_soa_extracto.md</w:t>
       </w:r>
       <w:r>
         <w:t xml:space="preserve"> PT03_soa_extracto.md y capturas de los 5 riesgos cargados en SimpleRisk con su plan de mitigación.</w:t>
@@ -3389,8 +3366,7 @@
         <w:pStyle w:val="FirstParagraph"/>
       </w:pPr>
       <w:r>
-        <w:lastRenderedPageBreak/>
-        <w:t>Anexo D — objetivos.txt (lista de IP autorizadas) y SHA256SUMS_E03.txt (cadena de custodia).</w:t>
+        <w:t>Anexo D — Objetivos autorizados y cadena de custodia. https://github.com/AngelVargasGutierrez/SI-084-TALLER-03/blob/taller-03/20_evidencia/E03_scan/objetivos.txt y https://github.com/AngelVargasGutierrez/SI-084-TALLER-03/blob/taller-03/20_evidencia/SHA256SUMS_E03.txt</w:t>
       </w:r>
     </w:p>
     <w:sectPr>

</xml_diff>

<commit_message>
Taller 03: capturas con formato APA 7 (Figura N, nota Auditoria propia) y tamano reducido
</commit_message>
<xml_diff>
--- a/SI084-S03-TALLER-VargasGutierrez.docx
+++ b/SI084-S03-TALLER-VargasGutierrez.docx
@@ -196,6 +196,9 @@
         <w:t>I</w:t>
       </w:r>
       <w:r>
+        <w:t xml:space="preserve"> </w:t>
+      </w:r>
+      <w:r>
         <w:t>· Trabajo individual</w:t>
       </w:r>
     </w:p>
@@ -280,7 +283,7 @@
       <w:pPr>
         <w:pStyle w:val="Ttulo1"/>
       </w:pPr>
-      <w:bookmarkStart w:id="0" w:name="_Toc239258943"/>
+      <w:bookmarkStart w:id="0" w:name="_Toc239261490"/>
       <w:r>
         <w:lastRenderedPageBreak/>
         <w:t>Índice</w:t>
@@ -294,6 +297,7 @@
           <w:tab w:val="right" w:leader="dot" w:pos="9344"/>
         </w:tabs>
         <w:rPr>
+          <w:rFonts w:asciiTheme="minorHAnsi" w:eastAsiaTheme="minorEastAsia" w:hAnsiTheme="minorHAnsi" w:cstheme="minorBidi"/>
           <w:noProof/>
         </w:rPr>
       </w:pPr>
@@ -306,7 +310,7 @@
       <w:r>
         <w:fldChar w:fldCharType="separate"/>
       </w:r>
-      <w:hyperlink w:anchor="_Toc239258943" w:history="1">
+      <w:hyperlink w:anchor="_Toc239261490" w:history="1">
         <w:r>
           <w:rPr>
             <w:rStyle w:val="Hipervnculo"/>
@@ -333,7 +337,7 @@
             <w:noProof/>
             <w:webHidden/>
           </w:rPr>
-          <w:instrText xml:space="preserve"> PAGEREF _Toc239258943 \h </w:instrText>
+          <w:instrText xml:space="preserve"> PAGEREF _Toc239261490 \h </w:instrText>
         </w:r>
         <w:r>
           <w:rPr>
@@ -371,10 +375,11 @@
           <w:tab w:val="right" w:leader="dot" w:pos="9344"/>
         </w:tabs>
         <w:rPr>
+          <w:rFonts w:asciiTheme="minorHAnsi" w:eastAsiaTheme="minorEastAsia" w:hAnsiTheme="minorHAnsi" w:cstheme="minorBidi"/>
           <w:noProof/>
         </w:rPr>
       </w:pPr>
-      <w:hyperlink w:anchor="_Toc239258944" w:history="1">
+      <w:hyperlink w:anchor="_Toc239261491" w:history="1">
         <w:r>
           <w:rPr>
             <w:rStyle w:val="Hipervnculo"/>
@@ -401,7 +406,7 @@
             <w:noProof/>
             <w:webHidden/>
           </w:rPr>
-          <w:instrText xml:space="preserve"> PAGEREF _Toc239258944 \h </w:instrText>
+          <w:instrText xml:space="preserve"> PAGEREF _Toc239261491 \h </w:instrText>
         </w:r>
         <w:r>
           <w:rPr>
@@ -421,7 +426,7 @@
             <w:noProof/>
             <w:webHidden/>
           </w:rPr>
-          <w:t>4</w:t>
+          <w:t>3</w:t>
         </w:r>
         <w:r>
           <w:rPr>
@@ -439,10 +444,11 @@
           <w:tab w:val="right" w:leader="dot" w:pos="9344"/>
         </w:tabs>
         <w:rPr>
+          <w:rFonts w:asciiTheme="minorHAnsi" w:eastAsiaTheme="minorEastAsia" w:hAnsiTheme="minorHAnsi" w:cstheme="minorBidi"/>
           <w:noProof/>
         </w:rPr>
       </w:pPr>
-      <w:hyperlink w:anchor="_Toc239258945" w:history="1">
+      <w:hyperlink w:anchor="_Toc239261492" w:history="1">
         <w:r>
           <w:rPr>
             <w:rStyle w:val="Hipervnculo"/>
@@ -469,7 +475,7 @@
             <w:noProof/>
             <w:webHidden/>
           </w:rPr>
-          <w:instrText xml:space="preserve"> PAGEREF _Toc239258945 \h </w:instrText>
+          <w:instrText xml:space="preserve"> PAGEREF _Toc239261492 \h </w:instrText>
         </w:r>
         <w:r>
           <w:rPr>
@@ -489,7 +495,7 @@
             <w:noProof/>
             <w:webHidden/>
           </w:rPr>
-          <w:t>4</w:t>
+          <w:t>3</w:t>
         </w:r>
         <w:r>
           <w:rPr>
@@ -507,10 +513,11 @@
           <w:tab w:val="right" w:leader="dot" w:pos="9344"/>
         </w:tabs>
         <w:rPr>
+          <w:rFonts w:asciiTheme="minorHAnsi" w:eastAsiaTheme="minorEastAsia" w:hAnsiTheme="minorHAnsi" w:cstheme="minorBidi"/>
           <w:noProof/>
         </w:rPr>
       </w:pPr>
-      <w:hyperlink w:anchor="_Toc239258946" w:history="1">
+      <w:hyperlink w:anchor="_Toc239261493" w:history="1">
         <w:r>
           <w:rPr>
             <w:rStyle w:val="Hipervnculo"/>
@@ -537,7 +544,7 @@
             <w:noProof/>
             <w:webHidden/>
           </w:rPr>
-          <w:instrText xml:space="preserve"> PAGEREF _Toc239258946 \h </w:instrText>
+          <w:instrText xml:space="preserve"> PAGEREF _Toc239261493 \h </w:instrText>
         </w:r>
         <w:r>
           <w:rPr>
@@ -557,7 +564,7 @@
             <w:noProof/>
             <w:webHidden/>
           </w:rPr>
-          <w:t>4</w:t>
+          <w:t>3</w:t>
         </w:r>
         <w:r>
           <w:rPr>
@@ -575,10 +582,11 @@
           <w:tab w:val="right" w:leader="dot" w:pos="9344"/>
         </w:tabs>
         <w:rPr>
+          <w:rFonts w:asciiTheme="minorHAnsi" w:eastAsiaTheme="minorEastAsia" w:hAnsiTheme="minorHAnsi" w:cstheme="minorBidi"/>
           <w:noProof/>
         </w:rPr>
       </w:pPr>
-      <w:hyperlink w:anchor="_Toc239258947" w:history="1">
+      <w:hyperlink w:anchor="_Toc239261494" w:history="1">
         <w:r>
           <w:rPr>
             <w:rStyle w:val="Hipervnculo"/>
@@ -605,7 +613,7 @@
             <w:noProof/>
             <w:webHidden/>
           </w:rPr>
-          <w:instrText xml:space="preserve"> PAGEREF _Toc239258947 \h </w:instrText>
+          <w:instrText xml:space="preserve"> PAGEREF _Toc239261494 \h </w:instrText>
         </w:r>
         <w:r>
           <w:rPr>
@@ -625,7 +633,7 @@
             <w:noProof/>
             <w:webHidden/>
           </w:rPr>
-          <w:t>4</w:t>
+          <w:t>3</w:t>
         </w:r>
         <w:r>
           <w:rPr>
@@ -643,10 +651,11 @@
           <w:tab w:val="right" w:leader="dot" w:pos="9344"/>
         </w:tabs>
         <w:rPr>
+          <w:rFonts w:asciiTheme="minorHAnsi" w:eastAsiaTheme="minorEastAsia" w:hAnsiTheme="minorHAnsi" w:cstheme="minorBidi"/>
           <w:noProof/>
         </w:rPr>
       </w:pPr>
-      <w:hyperlink w:anchor="_Toc239258948" w:history="1">
+      <w:hyperlink w:anchor="_Toc239261495" w:history="1">
         <w:r>
           <w:rPr>
             <w:rStyle w:val="Hipervnculo"/>
@@ -673,7 +682,7 @@
             <w:noProof/>
             <w:webHidden/>
           </w:rPr>
-          <w:instrText xml:space="preserve"> PAGEREF _Toc239258948 \h </w:instrText>
+          <w:instrText xml:space="preserve"> PAGEREF _Toc239261495 \h </w:instrText>
         </w:r>
         <w:r>
           <w:rPr>
@@ -693,7 +702,7 @@
             <w:noProof/>
             <w:webHidden/>
           </w:rPr>
-          <w:t>4</w:t>
+          <w:t>3</w:t>
         </w:r>
         <w:r>
           <w:rPr>
@@ -711,10 +720,11 @@
           <w:tab w:val="right" w:leader="dot" w:pos="9344"/>
         </w:tabs>
         <w:rPr>
+          <w:rFonts w:asciiTheme="minorHAnsi" w:eastAsiaTheme="minorEastAsia" w:hAnsiTheme="minorHAnsi" w:cstheme="minorBidi"/>
           <w:noProof/>
         </w:rPr>
       </w:pPr>
-      <w:hyperlink w:anchor="_Toc239258949" w:history="1">
+      <w:hyperlink w:anchor="_Toc239261496" w:history="1">
         <w:r>
           <w:rPr>
             <w:rStyle w:val="Hipervnculo"/>
@@ -741,7 +751,7 @@
             <w:noProof/>
             <w:webHidden/>
           </w:rPr>
-          <w:instrText xml:space="preserve"> PAGEREF _Toc239258949 \h </w:instrText>
+          <w:instrText xml:space="preserve"> PAGEREF _Toc239261496 \h </w:instrText>
         </w:r>
         <w:r>
           <w:rPr>
@@ -761,7 +771,7 @@
             <w:noProof/>
             <w:webHidden/>
           </w:rPr>
-          <w:t>4</w:t>
+          <w:t>3</w:t>
         </w:r>
         <w:r>
           <w:rPr>
@@ -779,10 +789,11 @@
           <w:tab w:val="right" w:leader="dot" w:pos="9344"/>
         </w:tabs>
         <w:rPr>
+          <w:rFonts w:asciiTheme="minorHAnsi" w:eastAsiaTheme="minorEastAsia" w:hAnsiTheme="minorHAnsi" w:cstheme="minorBidi"/>
           <w:noProof/>
         </w:rPr>
       </w:pPr>
-      <w:hyperlink w:anchor="_Toc239258950" w:history="1">
+      <w:hyperlink w:anchor="_Toc239261497" w:history="1">
         <w:r>
           <w:rPr>
             <w:rStyle w:val="Hipervnculo"/>
@@ -809,7 +820,7 @@
             <w:noProof/>
             <w:webHidden/>
           </w:rPr>
-          <w:instrText xml:space="preserve"> PAGEREF _Toc239258950 \h </w:instrText>
+          <w:instrText xml:space="preserve"> PAGEREF _Toc239261497 \h </w:instrText>
         </w:r>
         <w:r>
           <w:rPr>
@@ -829,7 +840,7 @@
             <w:noProof/>
             <w:webHidden/>
           </w:rPr>
-          <w:t>5</w:t>
+          <w:t>4</w:t>
         </w:r>
         <w:r>
           <w:rPr>
@@ -847,10 +858,11 @@
           <w:tab w:val="right" w:leader="dot" w:pos="9344"/>
         </w:tabs>
         <w:rPr>
+          <w:rFonts w:asciiTheme="minorHAnsi" w:eastAsiaTheme="minorEastAsia" w:hAnsiTheme="minorHAnsi" w:cstheme="minorBidi"/>
           <w:noProof/>
         </w:rPr>
       </w:pPr>
-      <w:hyperlink w:anchor="_Toc239258951" w:history="1">
+      <w:hyperlink w:anchor="_Toc239261498" w:history="1">
         <w:r>
           <w:rPr>
             <w:rStyle w:val="Hipervnculo"/>
@@ -877,7 +889,7 @@
             <w:noProof/>
             <w:webHidden/>
           </w:rPr>
-          <w:instrText xml:space="preserve"> PAGEREF _Toc239258951 \h </w:instrText>
+          <w:instrText xml:space="preserve"> PAGEREF _Toc239261498 \h </w:instrText>
         </w:r>
         <w:r>
           <w:rPr>
@@ -897,7 +909,7 @@
             <w:noProof/>
             <w:webHidden/>
           </w:rPr>
-          <w:t>5</w:t>
+          <w:t>4</w:t>
         </w:r>
         <w:r>
           <w:rPr>
@@ -915,10 +927,11 @@
           <w:tab w:val="right" w:leader="dot" w:pos="9344"/>
         </w:tabs>
         <w:rPr>
+          <w:rFonts w:asciiTheme="minorHAnsi" w:eastAsiaTheme="minorEastAsia" w:hAnsiTheme="minorHAnsi" w:cstheme="minorBidi"/>
           <w:noProof/>
         </w:rPr>
       </w:pPr>
-      <w:hyperlink w:anchor="_Toc239258952" w:history="1">
+      <w:hyperlink w:anchor="_Toc239261499" w:history="1">
         <w:r>
           <w:rPr>
             <w:rStyle w:val="Hipervnculo"/>
@@ -945,7 +958,7 @@
             <w:noProof/>
             <w:webHidden/>
           </w:rPr>
-          <w:instrText xml:space="preserve"> PAGEREF _Toc239258952 \h </w:instrText>
+          <w:instrText xml:space="preserve"> PAGEREF _Toc239261499 \h </w:instrText>
         </w:r>
         <w:r>
           <w:rPr>
@@ -965,7 +978,7 @@
             <w:noProof/>
             <w:webHidden/>
           </w:rPr>
-          <w:t>5</w:t>
+          <w:t>4</w:t>
         </w:r>
         <w:r>
           <w:rPr>
@@ -983,10 +996,11 @@
           <w:tab w:val="right" w:leader="dot" w:pos="9344"/>
         </w:tabs>
         <w:rPr>
+          <w:rFonts w:asciiTheme="minorHAnsi" w:eastAsiaTheme="minorEastAsia" w:hAnsiTheme="minorHAnsi" w:cstheme="minorBidi"/>
           <w:noProof/>
         </w:rPr>
       </w:pPr>
-      <w:hyperlink w:anchor="_Toc239258953" w:history="1">
+      <w:hyperlink w:anchor="_Toc239261500" w:history="1">
         <w:r>
           <w:rPr>
             <w:rStyle w:val="Hipervnculo"/>
@@ -1013,7 +1027,7 @@
             <w:noProof/>
             <w:webHidden/>
           </w:rPr>
-          <w:instrText xml:space="preserve"> PAGEREF _Toc239258953 \h </w:instrText>
+          <w:instrText xml:space="preserve"> PAGEREF _Toc239261500 \h </w:instrText>
         </w:r>
         <w:r>
           <w:rPr>
@@ -1051,10 +1065,11 @@
           <w:tab w:val="right" w:leader="dot" w:pos="9344"/>
         </w:tabs>
         <w:rPr>
+          <w:rFonts w:asciiTheme="minorHAnsi" w:eastAsiaTheme="minorEastAsia" w:hAnsiTheme="minorHAnsi" w:cstheme="minorBidi"/>
           <w:noProof/>
         </w:rPr>
       </w:pPr>
-      <w:hyperlink w:anchor="_Toc239258954" w:history="1">
+      <w:hyperlink w:anchor="_Toc239261501" w:history="1">
         <w:r>
           <w:rPr>
             <w:rStyle w:val="Hipervnculo"/>
@@ -1081,7 +1096,145 @@
             <w:noProof/>
             <w:webHidden/>
           </w:rPr>
-          <w:instrText xml:space="preserve"> PAGEREF _Toc239258954 \h </w:instrText>
+          <w:instrText xml:space="preserve"> PAGEREF _Toc239261501 \h </w:instrText>
+        </w:r>
+        <w:r>
+          <w:rPr>
+            <w:noProof/>
+            <w:webHidden/>
+          </w:rPr>
+        </w:r>
+        <w:r>
+          <w:rPr>
+            <w:noProof/>
+            <w:webHidden/>
+          </w:rPr>
+          <w:fldChar w:fldCharType="separate"/>
+        </w:r>
+        <w:r>
+          <w:rPr>
+            <w:noProof/>
+            <w:webHidden/>
+          </w:rPr>
+          <w:t>5</w:t>
+        </w:r>
+        <w:r>
+          <w:rPr>
+            <w:noProof/>
+            <w:webHidden/>
+          </w:rPr>
+          <w:fldChar w:fldCharType="end"/>
+        </w:r>
+      </w:hyperlink>
+    </w:p>
+    <w:p>
+      <w:pPr>
+        <w:pStyle w:val="TDC2"/>
+        <w:tabs>
+          <w:tab w:val="right" w:leader="dot" w:pos="9344"/>
+        </w:tabs>
+        <w:rPr>
+          <w:rFonts w:asciiTheme="minorHAnsi" w:eastAsiaTheme="minorEastAsia" w:hAnsiTheme="minorHAnsi" w:cstheme="minorBidi"/>
+          <w:noProof/>
+        </w:rPr>
+      </w:pPr>
+      <w:hyperlink w:anchor="_Toc239261502" w:history="1">
+        <w:r>
+          <w:rPr>
+            <w:rStyle w:val="Hipervnculo"/>
+            <w:noProof/>
+          </w:rPr>
+          <w:t>Paso D</w:t>
+        </w:r>
+        <w:r>
+          <w:rPr>
+            <w:noProof/>
+            <w:webHidden/>
+          </w:rPr>
+          <w:tab/>
+        </w:r>
+        <w:r>
+          <w:rPr>
+            <w:noProof/>
+            <w:webHidden/>
+          </w:rPr>
+          <w:fldChar w:fldCharType="begin"/>
+        </w:r>
+        <w:r>
+          <w:rPr>
+            <w:noProof/>
+            <w:webHidden/>
+          </w:rPr>
+          <w:instrText xml:space="preserve"> PAGEREF _Toc239261502 \h </w:instrText>
+        </w:r>
+        <w:r>
+          <w:rPr>
+            <w:noProof/>
+            <w:webHidden/>
+          </w:rPr>
+        </w:r>
+        <w:r>
+          <w:rPr>
+            <w:noProof/>
+            <w:webHidden/>
+          </w:rPr>
+          <w:fldChar w:fldCharType="separate"/>
+        </w:r>
+        <w:r>
+          <w:rPr>
+            <w:noProof/>
+            <w:webHidden/>
+          </w:rPr>
+          <w:t>6</w:t>
+        </w:r>
+        <w:r>
+          <w:rPr>
+            <w:noProof/>
+            <w:webHidden/>
+          </w:rPr>
+          <w:fldChar w:fldCharType="end"/>
+        </w:r>
+      </w:hyperlink>
+    </w:p>
+    <w:p>
+      <w:pPr>
+        <w:pStyle w:val="TDC2"/>
+        <w:tabs>
+          <w:tab w:val="right" w:leader="dot" w:pos="9344"/>
+        </w:tabs>
+        <w:rPr>
+          <w:rFonts w:asciiTheme="minorHAnsi" w:eastAsiaTheme="minorEastAsia" w:hAnsiTheme="minorHAnsi" w:cstheme="minorBidi"/>
+          <w:noProof/>
+        </w:rPr>
+      </w:pPr>
+      <w:hyperlink w:anchor="_Toc239261503" w:history="1">
+        <w:r>
+          <w:rPr>
+            <w:rStyle w:val="Hipervnculo"/>
+            <w:noProof/>
+          </w:rPr>
+          <w:t>Paso E</w:t>
+        </w:r>
+        <w:r>
+          <w:rPr>
+            <w:noProof/>
+            <w:webHidden/>
+          </w:rPr>
+          <w:tab/>
+        </w:r>
+        <w:r>
+          <w:rPr>
+            <w:noProof/>
+            <w:webHidden/>
+          </w:rPr>
+          <w:fldChar w:fldCharType="begin"/>
+        </w:r>
+        <w:r>
+          <w:rPr>
+            <w:noProof/>
+            <w:webHidden/>
+          </w:rPr>
+          <w:instrText xml:space="preserve"> PAGEREF _Toc239261503 \h </w:instrText>
         </w:r>
         <w:r>
           <w:rPr>
@@ -1119,10 +1272,11 @@
           <w:tab w:val="right" w:leader="dot" w:pos="9344"/>
         </w:tabs>
         <w:rPr>
+          <w:rFonts w:asciiTheme="minorHAnsi" w:eastAsiaTheme="minorEastAsia" w:hAnsiTheme="minorHAnsi" w:cstheme="minorBidi"/>
           <w:noProof/>
         </w:rPr>
       </w:pPr>
-      <w:hyperlink w:anchor="_Toc239258955" w:history="1">
+      <w:hyperlink w:anchor="_Toc239261504" w:history="1">
         <w:r>
           <w:rPr>
             <w:rStyle w:val="Hipervnculo"/>
@@ -1149,7 +1303,7 @@
             <w:noProof/>
             <w:webHidden/>
           </w:rPr>
-          <w:instrText xml:space="preserve"> PAGEREF _Toc239258955 \h </w:instrText>
+          <w:instrText xml:space="preserve"> PAGEREF _Toc239261504 \h </w:instrText>
         </w:r>
         <w:r>
           <w:rPr>
@@ -1187,10 +1341,11 @@
           <w:tab w:val="right" w:leader="dot" w:pos="9344"/>
         </w:tabs>
         <w:rPr>
+          <w:rFonts w:asciiTheme="minorHAnsi" w:eastAsiaTheme="minorEastAsia" w:hAnsiTheme="minorHAnsi" w:cstheme="minorBidi"/>
           <w:noProof/>
         </w:rPr>
       </w:pPr>
-      <w:hyperlink w:anchor="_Toc239258956" w:history="1">
+      <w:hyperlink w:anchor="_Toc239261505" w:history="1">
         <w:r>
           <w:rPr>
             <w:rStyle w:val="Hipervnculo"/>
@@ -1217,7 +1372,7 @@
             <w:noProof/>
             <w:webHidden/>
           </w:rPr>
-          <w:instrText xml:space="preserve"> PAGEREF _Toc239258956 \h </w:instrText>
+          <w:instrText xml:space="preserve"> PAGEREF _Toc239261505 \h </w:instrText>
         </w:r>
         <w:r>
           <w:rPr>
@@ -1237,7 +1392,7 @@
             <w:noProof/>
             <w:webHidden/>
           </w:rPr>
-          <w:t>6</w:t>
+          <w:t>8</w:t>
         </w:r>
         <w:r>
           <w:rPr>
@@ -1255,10 +1410,11 @@
           <w:tab w:val="right" w:leader="dot" w:pos="9344"/>
         </w:tabs>
         <w:rPr>
+          <w:rFonts w:asciiTheme="minorHAnsi" w:eastAsiaTheme="minorEastAsia" w:hAnsiTheme="minorHAnsi" w:cstheme="minorBidi"/>
           <w:noProof/>
         </w:rPr>
       </w:pPr>
-      <w:hyperlink w:anchor="_Toc239258957" w:history="1">
+      <w:hyperlink w:anchor="_Toc239261506" w:history="1">
         <w:r>
           <w:rPr>
             <w:rStyle w:val="Hipervnculo"/>
@@ -1285,7 +1441,7 @@
             <w:noProof/>
             <w:webHidden/>
           </w:rPr>
-          <w:instrText xml:space="preserve"> PAGEREF _Toc239258957 \h </w:instrText>
+          <w:instrText xml:space="preserve"> PAGEREF _Toc239261506 \h </w:instrText>
         </w:r>
         <w:r>
           <w:rPr>
@@ -1305,7 +1461,7 @@
             <w:noProof/>
             <w:webHidden/>
           </w:rPr>
-          <w:t>6</w:t>
+          <w:t>8</w:t>
         </w:r>
         <w:r>
           <w:rPr>
@@ -1323,10 +1479,11 @@
           <w:tab w:val="right" w:leader="dot" w:pos="9344"/>
         </w:tabs>
         <w:rPr>
+          <w:rFonts w:asciiTheme="minorHAnsi" w:eastAsiaTheme="minorEastAsia" w:hAnsiTheme="minorHAnsi" w:cstheme="minorBidi"/>
           <w:noProof/>
         </w:rPr>
       </w:pPr>
-      <w:hyperlink w:anchor="_Toc239258958" w:history="1">
+      <w:hyperlink w:anchor="_Toc239261507" w:history="1">
         <w:r>
           <w:rPr>
             <w:rStyle w:val="Hipervnculo"/>
@@ -1353,7 +1510,7 @@
             <w:noProof/>
             <w:webHidden/>
           </w:rPr>
-          <w:instrText xml:space="preserve"> PAGEREF _Toc239258958 \h </w:instrText>
+          <w:instrText xml:space="preserve"> PAGEREF _Toc239261507 \h </w:instrText>
         </w:r>
         <w:r>
           <w:rPr>
@@ -1373,7 +1530,7 @@
             <w:noProof/>
             <w:webHidden/>
           </w:rPr>
-          <w:t>6</w:t>
+          <w:t>8</w:t>
         </w:r>
         <w:r>
           <w:rPr>
@@ -1391,10 +1548,11 @@
           <w:tab w:val="right" w:leader="dot" w:pos="9344"/>
         </w:tabs>
         <w:rPr>
+          <w:rFonts w:asciiTheme="minorHAnsi" w:eastAsiaTheme="minorEastAsia" w:hAnsiTheme="minorHAnsi" w:cstheme="minorBidi"/>
           <w:noProof/>
         </w:rPr>
       </w:pPr>
-      <w:hyperlink w:anchor="_Toc239258959" w:history="1">
+      <w:hyperlink w:anchor="_Toc239261508" w:history="1">
         <w:r>
           <w:rPr>
             <w:rStyle w:val="Hipervnculo"/>
@@ -1421,7 +1579,7 @@
             <w:noProof/>
             <w:webHidden/>
           </w:rPr>
-          <w:instrText xml:space="preserve"> PAGEREF _Toc239258959 \h </w:instrText>
+          <w:instrText xml:space="preserve"> PAGEREF _Toc239261508 \h </w:instrText>
         </w:r>
         <w:r>
           <w:rPr>
@@ -1441,7 +1599,7 @@
             <w:noProof/>
             <w:webHidden/>
           </w:rPr>
-          <w:t>6</w:t>
+          <w:t>9</w:t>
         </w:r>
         <w:r>
           <w:rPr>
@@ -1467,45 +1625,48 @@
       <w:pPr>
         <w:pStyle w:val="Ttulo1"/>
       </w:pPr>
-      <w:bookmarkStart w:id="2" w:name="_Toc239258944"/>
-      <w:bookmarkStart w:id="3" w:name="información-sobre-el-evento-práctico"/>
+      <w:bookmarkStart w:id="2" w:name="información-sobre-el-evento-práctico"/>
+      <w:bookmarkStart w:id="3" w:name="_Toc239261491"/>
       <w:bookmarkEnd w:id="1"/>
       <w:r>
         <w:lastRenderedPageBreak/>
         <w:t>1. Información sobre el evento práctico</w:t>
       </w:r>
-      <w:bookmarkEnd w:id="2"/>
+      <w:bookmarkEnd w:id="3"/>
     </w:p>
     <w:p>
       <w:pPr>
         <w:pStyle w:val="Ttulo2"/>
-      </w:pPr>
-      <w:bookmarkStart w:id="4" w:name="_Toc239258945"/>
-      <w:bookmarkStart w:id="5" w:name="título-del-evento-práctico"/>
+        <w:ind w:left="720"/>
+      </w:pPr>
+      <w:bookmarkStart w:id="4" w:name="título-del-evento-práctico"/>
+      <w:bookmarkStart w:id="5" w:name="_Toc239261492"/>
       <w:r>
         <w:t>1.1 Título del evento práctico</w:t>
       </w:r>
+      <w:bookmarkEnd w:id="5"/>
+    </w:p>
+    <w:p>
+      <w:pPr>
+        <w:pStyle w:val="FirstParagraph"/>
+        <w:ind w:left="1440"/>
+      </w:pPr>
+      <w:r>
+        <w:t>Apreciación y tratamiento del riesgo de seguridad de la información sobre el entorno auditado, alimentada por evidencia técnica de vulnerabilidades obtenida con el escáner Greenbone/OpenVAS.</w:t>
+      </w:r>
+    </w:p>
+    <w:p>
+      <w:pPr>
+        <w:pStyle w:val="Ttulo2"/>
+        <w:ind w:left="720"/>
+      </w:pPr>
+      <w:bookmarkStart w:id="6" w:name="objetivos"/>
+      <w:bookmarkStart w:id="7" w:name="_Toc239261493"/>
       <w:bookmarkEnd w:id="4"/>
-    </w:p>
-    <w:p>
-      <w:pPr>
-        <w:pStyle w:val="FirstParagraph"/>
-      </w:pPr>
-      <w:r>
-        <w:t>Apreciación y tratamiento del riesgo de seguridad de la información sobre el entorno auditado, alimentada por evidencia técnica de vulnerabilidades obtenida con el escáner Greenbone/OpenVAS.</w:t>
-      </w:r>
-    </w:p>
-    <w:p>
-      <w:pPr>
-        <w:pStyle w:val="Ttulo2"/>
-      </w:pPr>
-      <w:bookmarkStart w:id="6" w:name="_Toc239258946"/>
-      <w:bookmarkStart w:id="7" w:name="objetivos"/>
-      <w:bookmarkEnd w:id="5"/>
       <w:r>
         <w:t>1.2 Objetivos</w:t>
       </w:r>
-      <w:bookmarkEnd w:id="6"/>
+      <w:bookmarkEnd w:id="7"/>
     </w:p>
     <w:p>
       <w:pPr>
@@ -1514,6 +1675,7 @@
           <w:ilvl w:val="0"/>
           <w:numId w:val="2"/>
         </w:numPr>
+        <w:ind w:left="1800"/>
         <w:rPr>
           <w:lang w:val="en-US"/>
         </w:rPr>
@@ -1582,6 +1744,7 @@
           <w:ilvl w:val="0"/>
           <w:numId w:val="2"/>
         </w:numPr>
+        <w:ind w:left="1800"/>
       </w:pPr>
       <w:r>
         <w:t>Ejecutar un escaneo autenticado y no autenticado de vulnerabilidades sobre el entorno si084-lab.</w:t>
@@ -1594,6 +1757,7 @@
           <w:ilvl w:val="0"/>
           <w:numId w:val="2"/>
         </w:numPr>
+        <w:ind w:left="1800"/>
       </w:pPr>
       <w:r>
         <w:t>Interpretar los resultados en términos de CVE, CVSS v3.1 y vector de ataque, distinguiendo severidad técnica de riesgo de negocio.</w:t>
@@ -1606,6 +1770,7 @@
           <w:ilvl w:val="0"/>
           <w:numId w:val="2"/>
         </w:numPr>
+        <w:ind w:left="1800"/>
       </w:pPr>
       <w:r>
         <w:t>Convertir hallazgos técnicos en riesgos de negocio registrados con activo, amenaza, vulnerabilidad, probabilidad, impacto y dueño.</w:t>
@@ -1618,6 +1783,7 @@
           <w:ilvl w:val="0"/>
           <w:numId w:val="2"/>
         </w:numPr>
+        <w:ind w:left="1800"/>
       </w:pPr>
       <w:r>
         <w:t>Construir la matriz de riesgo inherente y residual y el plan de tratamiento.</w:t>
@@ -1630,6 +1796,7 @@
           <w:ilvl w:val="0"/>
           <w:numId w:val="2"/>
         </w:numPr>
+        <w:ind w:left="1800"/>
       </w:pPr>
       <w:r>
         <w:t>Elaborar un extracto de Declaración de Aplicabilidad (SoA) para los controles involucrados.</w:t>
@@ -1638,34 +1805,37 @@
     <w:p>
       <w:pPr>
         <w:pStyle w:val="Ttulo2"/>
-      </w:pPr>
-      <w:bookmarkStart w:id="8" w:name="_Toc239258947"/>
-      <w:bookmarkStart w:id="9" w:name="tiempo-de-duración"/>
-      <w:bookmarkEnd w:id="7"/>
+        <w:ind w:left="720"/>
+      </w:pPr>
+      <w:bookmarkStart w:id="8" w:name="tiempo-de-duración"/>
+      <w:bookmarkStart w:id="9" w:name="_Toc239261494"/>
+      <w:bookmarkEnd w:id="6"/>
       <w:r>
         <w:t>1.3 Tiempo de duración</w:t>
       </w:r>
+      <w:bookmarkEnd w:id="9"/>
+    </w:p>
+    <w:p>
+      <w:pPr>
+        <w:pStyle w:val="FirstParagraph"/>
+        <w:ind w:left="720" w:firstLine="720"/>
+      </w:pPr>
+      <w:r>
+        <w:t>100 minutos: 60 de taller guiado y 40 de avance asistido.</w:t>
+      </w:r>
+    </w:p>
+    <w:p>
+      <w:pPr>
+        <w:pStyle w:val="Ttulo2"/>
+        <w:ind w:left="720"/>
+      </w:pPr>
+      <w:bookmarkStart w:id="10" w:name="resultados-de-aprendizaje"/>
+      <w:bookmarkStart w:id="11" w:name="_Toc239261495"/>
       <w:bookmarkEnd w:id="8"/>
-    </w:p>
-    <w:p>
-      <w:pPr>
-        <w:pStyle w:val="FirstParagraph"/>
-      </w:pPr>
-      <w:r>
-        <w:t>100 minutos: 60 de taller guiado y 40 de avance asistido.</w:t>
-      </w:r>
-    </w:p>
-    <w:p>
-      <w:pPr>
-        <w:pStyle w:val="Ttulo2"/>
-      </w:pPr>
-      <w:bookmarkStart w:id="10" w:name="_Toc239258948"/>
-      <w:bookmarkStart w:id="11" w:name="resultados-de-aprendizaje"/>
-      <w:bookmarkEnd w:id="9"/>
       <w:r>
         <w:t>1.4 Resultados de aprendizaje</w:t>
       </w:r>
-      <w:bookmarkEnd w:id="10"/>
+      <w:bookmarkEnd w:id="11"/>
     </w:p>
     <w:p>
       <w:pPr>
@@ -1674,6 +1844,7 @@
           <w:ilvl w:val="0"/>
           <w:numId w:val="2"/>
         </w:numPr>
+        <w:ind w:left="1800"/>
       </w:pPr>
       <w:r>
         <w:t>RA1 — Analiza e interpreta los conceptos y terminología de Auditoría de Sistemas.</w:t>
@@ -1686,6 +1857,7 @@
           <w:ilvl w:val="0"/>
           <w:numId w:val="2"/>
         </w:numPr>
+        <w:ind w:left="1800"/>
       </w:pPr>
       <w:r>
         <w:t>RA2 — Evalúa la seguridad de la información en Auditoría de Sistemas.</w:t>
@@ -1695,13 +1867,13 @@
       <w:pPr>
         <w:pStyle w:val="Ttulo2"/>
       </w:pPr>
-      <w:bookmarkStart w:id="12" w:name="_Toc239258949"/>
-      <w:bookmarkStart w:id="13" w:name="recursos"/>
-      <w:bookmarkEnd w:id="11"/>
+      <w:bookmarkStart w:id="12" w:name="recursos"/>
+      <w:bookmarkStart w:id="13" w:name="_Toc239261496"/>
+      <w:bookmarkEnd w:id="10"/>
       <w:r>
         <w:t>1.5 Recursos</w:t>
       </w:r>
-      <w:bookmarkEnd w:id="12"/>
+      <w:bookmarkEnd w:id="13"/>
     </w:p>
     <w:tbl>
       <w:tblPr>
@@ -1978,7 +2150,11 @@
           </w:tcPr>
           <w:p>
             <w:r>
-              <w:t>Conversión del reporte técnico de Greenbone a registro de riesgos de negocio.</w:t>
+              <w:t xml:space="preserve">Conversión del reporte técnico de Greenbone a registro de riesgos de </w:t>
+            </w:r>
+            <w:r>
+              <w:lastRenderedPageBreak/>
+              <w:t>negocio.</w:t>
             </w:r>
           </w:p>
         </w:tc>
@@ -2021,13 +2197,13 @@
       <w:pPr>
         <w:pStyle w:val="Ttulo2"/>
       </w:pPr>
-      <w:bookmarkStart w:id="14" w:name="_Toc239258950"/>
-      <w:bookmarkStart w:id="15" w:name="seguridad"/>
-      <w:bookmarkEnd w:id="13"/>
+      <w:bookmarkStart w:id="14" w:name="seguridad"/>
+      <w:bookmarkStart w:id="15" w:name="_Toc239261497"/>
+      <w:bookmarkEnd w:id="12"/>
       <w:r>
         <w:t>1.6 Seguridad</w:t>
       </w:r>
-      <w:bookmarkEnd w:id="14"/>
+      <w:bookmarkEnd w:id="15"/>
     </w:p>
     <w:p>
       <w:pPr>
@@ -2078,14 +2254,14 @@
       <w:pPr>
         <w:pStyle w:val="Ttulo1"/>
       </w:pPr>
-      <w:bookmarkStart w:id="16" w:name="_Toc239258951"/>
-      <w:bookmarkStart w:id="17" w:name="procedimiento-o-metodología"/>
-      <w:bookmarkEnd w:id="3"/>
-      <w:bookmarkEnd w:id="15"/>
+      <w:bookmarkStart w:id="16" w:name="procedimiento-o-metodología"/>
+      <w:bookmarkStart w:id="17" w:name="_Toc239261498"/>
+      <w:bookmarkEnd w:id="2"/>
+      <w:bookmarkEnd w:id="14"/>
       <w:r>
         <w:t>2. Procedimiento o metodología</w:t>
       </w:r>
-      <w:bookmarkEnd w:id="16"/>
+      <w:bookmarkEnd w:id="17"/>
     </w:p>
     <w:p>
       <w:pPr>
@@ -2101,12 +2277,12 @@
         <w:pStyle w:val="Ttulo2"/>
         <w:ind w:left="720"/>
       </w:pPr>
-      <w:bookmarkStart w:id="18" w:name="_Toc239258952"/>
-      <w:bookmarkStart w:id="19" w:name="paso-a"/>
+      <w:bookmarkStart w:id="18" w:name="paso-a"/>
+      <w:bookmarkStart w:id="19" w:name="_Toc239261499"/>
       <w:r>
         <w:t>Paso A</w:t>
       </w:r>
-      <w:bookmarkEnd w:id="18"/>
+      <w:bookmarkEnd w:id="19"/>
     </w:p>
     <w:p>
       <w:pPr>
@@ -2161,6 +2337,33 @@
       <w:r>
         <w:t xml:space="preserve">Evidencia: captura de la interfaz y estado de los contenedores </w:t>
       </w:r>
+      <w:r>
+        <w:t xml:space="preserve"> (ver Figuras 1 y 2).</w:t>
+      </w:r>
+    </w:p>
+    <w:p>
+      <w:pPr>
+        <w:jc w:val="center"/>
+      </w:pPr>
+      <w:r>
+        <w:rPr>
+          <w:b/>
+          <w:i w:val="0"/>
+        </w:rPr>
+        <w:t>Figura 1</w:t>
+      </w:r>
+    </w:p>
+    <w:p>
+      <w:pPr>
+        <w:jc w:val="center"/>
+      </w:pPr>
+      <w:r>
+        <w:rPr>
+          <w:b w:val="0"/>
+          <w:i/>
+        </w:rPr>
+        <w:t>Panel de control (dashboard) de Greenbone/OpenVAS con NVT sincronizados</w:t>
+      </w:r>
     </w:p>
     <w:p>
       <w:pPr>
@@ -2170,10 +2373,10 @@
       <w:r>
         <w:lastRenderedPageBreak/>
         <w:drawing>
-          <wp:inline distT="0" distB="0" distL="0" distR="0" wp14:anchorId="41840003" wp14:editId="21BD9CFD">
-            <wp:extent cx="3175510" cy="2299648"/>
+          <wp:inline distT="0" distB="0" distL="0" distR="0" wp14:anchorId="56AD6748" wp14:editId="7D4CA8B2">
+            <wp:extent cx="4572000" cy="2961486"/>
             <wp:effectExtent l="0" t="0" r="0" b="0"/>
-            <wp:docPr id="4" name="Imagen 4"/>
+            <wp:docPr id="2" name="Imagen 2"/>
             <wp:cNvGraphicFramePr>
               <a:graphicFrameLocks xmlns:a="http://schemas.openxmlformats.org/drawingml/2006/main" noChangeAspect="1"/>
             </wp:cNvGraphicFramePr>
@@ -2193,7 +2396,7 @@
                   <pic:spPr>
                     <a:xfrm>
                       <a:off x="0" y="0"/>
-                      <a:ext cx="3185531" cy="2306905"/>
+                      <a:ext cx="4572000" cy="2961486"/>
                     </a:xfrm>
                     <a:prstGeom prst="rect">
                       <a:avLst/>
@@ -2208,20 +2411,113 @@
     </w:p>
     <w:p>
       <w:pPr>
+        <w:jc w:val="center"/>
+      </w:pPr>
+      <w:r>
+        <w:rPr>
+          <w:i/>
+        </w:rPr>
+        <w:t xml:space="preserve">Nota. </w:t>
+      </w:r>
+      <w:r>
+        <w:t>Auditoría propia.</w:t>
+      </w:r>
+    </w:p>
+    <w:p>
+      <w:pPr>
+        <w:jc w:val="center"/>
+      </w:pPr>
+      <w:r>
+        <w:rPr>
+          <w:b/>
+          <w:i w:val="0"/>
+        </w:rPr>
+        <w:t>Figura 2</w:t>
+      </w:r>
+    </w:p>
+    <w:p>
+      <w:pPr>
+        <w:jc w:val="center"/>
+      </w:pPr>
+      <w:r>
+        <w:rPr>
+          <w:b w:val="0"/>
+          <w:i/>
+        </w:rPr>
+        <w:t>Tarea de escaneo E03-Escaneo-si084-lab completada en Greenbone</w:t>
+      </w:r>
+    </w:p>
+    <w:p>
+      <w:pPr>
         <w:pStyle w:val="Textoindependiente"/>
-      </w:pPr>
+        <w:jc w:val="center"/>
+      </w:pPr>
+      <w:r>
+        <w:rPr>
+          <w:lang w:val="en-US"/>
+        </w:rPr>
+        <w:drawing>
+          <wp:inline distT="0" distB="0" distL="0" distR="0" wp14:anchorId="55481F69" wp14:editId="4AE9D456">
+            <wp:extent cx="4572000" cy="2595394"/>
+            <wp:effectExtent l="0" t="0" r="0" b="0"/>
+            <wp:docPr id="3" name="Imagen 3"/>
+            <wp:cNvGraphicFramePr>
+              <a:graphicFrameLocks xmlns:a="http://schemas.openxmlformats.org/drawingml/2006/main" noChangeAspect="1"/>
+            </wp:cNvGraphicFramePr>
+            <a:graphic xmlns:a="http://schemas.openxmlformats.org/drawingml/2006/main">
+              <a:graphicData uri="http://schemas.openxmlformats.org/drawingml/2006/picture">
+                <pic:pic xmlns:pic="http://schemas.openxmlformats.org/drawingml/2006/picture">
+                  <pic:nvPicPr>
+                    <pic:cNvPr id="1" name=""/>
+                    <pic:cNvPicPr/>
+                  </pic:nvPicPr>
+                  <pic:blipFill>
+                    <a:blip r:embed="rId10"/>
+                    <a:stretch>
+                      <a:fillRect/>
+                    </a:stretch>
+                  </pic:blipFill>
+                  <pic:spPr>
+                    <a:xfrm>
+                      <a:off x="0" y="0"/>
+                      <a:ext cx="4572000" cy="2595394"/>
+                    </a:xfrm>
+                    <a:prstGeom prst="rect">
+                      <a:avLst/>
+                    </a:prstGeom>
+                  </pic:spPr>
+                </pic:pic>
+              </a:graphicData>
+            </a:graphic>
+          </wp:inline>
+        </w:drawing>
+      </w:r>
+    </w:p>
+    <w:p>
+      <w:pPr>
+        <w:jc w:val="center"/>
+      </w:pPr>
+      <w:r>
+        <w:rPr>
+          <w:i/>
+        </w:rPr>
+        <w:t xml:space="preserve">Nota. </w:t>
+      </w:r>
+      <w:r>
+        <w:t>Auditoría propia.</w:t>
+      </w:r>
     </w:p>
     <w:p>
       <w:pPr>
         <w:pStyle w:val="Ttulo2"/>
       </w:pPr>
-      <w:bookmarkStart w:id="20" w:name="_Toc239258953"/>
-      <w:bookmarkStart w:id="21" w:name="paso-b"/>
-      <w:bookmarkEnd w:id="19"/>
+      <w:bookmarkStart w:id="20" w:name="paso-b"/>
+      <w:bookmarkStart w:id="21" w:name="_Toc239261500"/>
+      <w:bookmarkEnd w:id="18"/>
       <w:r>
         <w:t>Paso B</w:t>
       </w:r>
-      <w:bookmarkEnd w:id="20"/>
+      <w:bookmarkEnd w:id="21"/>
     </w:p>
     <w:p>
       <w:pPr>
@@ -2247,7 +2543,11 @@
         <w:ind w:left="720"/>
       </w:pPr>
       <w:r>
-        <w:t>Corrección de infraestructura: la imagen simplerisk/simplerisk fuerza redirección a HTTPS sin puerto explícito (RewriteRule ... https://%{SERVER_NAME}/), lo que colisionaba con el puerto 443 ya usado por Greenbone. Se expuso el puerto HTTPS interno de SimpleRisk en 127.0.0.1:8444 para separar ambos servicios.</w:t>
+        <w:t xml:space="preserve">Corrección de infraestructura: la imagen simplerisk/simplerisk fuerza redirección a HTTPS sin puerto explícito (RewriteRule ... https://%{SERVER_NAME}/), lo que </w:t>
+      </w:r>
+      <w:r>
+        <w:lastRenderedPageBreak/>
+        <w:t>colisionaba con el puerto 443 ya usado por Greenbone. Se expuso el puerto HTTPS interno de SimpleRisk en 127.0.0.1:8444 para separar ambos servicios.</w:t>
       </w:r>
     </w:p>
     <w:p>
@@ -2272,22 +2572,671 @@
       <w:pPr>
         <w:pStyle w:val="FirstParagraph"/>
         <w:ind w:left="720"/>
-      </w:pPr>
-      <w:r>
-        <w:t xml:space="preserve">Evidencia: captura de Risk Configuration → Classic Risk Formula </w:t>
-      </w:r>
+        <w:rPr>
+          <w:lang w:val="en-US"/>
+        </w:rPr>
+      </w:pPr>
+      <w:proofErr w:type="spellStart"/>
+      <w:r>
+        <w:rPr>
+          <w:lang w:val="en-US"/>
+        </w:rPr>
+        <w:t>Evidencia</w:t>
+      </w:r>
+      <w:proofErr w:type="spellEnd"/>
+      <w:r>
+        <w:rPr>
+          <w:lang w:val="en-US"/>
+        </w:rPr>
+        <w:t xml:space="preserve">: </w:t>
+      </w:r>
+      <w:proofErr w:type="spellStart"/>
+      <w:r>
+        <w:rPr>
+          <w:lang w:val="en-US"/>
+        </w:rPr>
+        <w:t>captura</w:t>
+      </w:r>
+      <w:proofErr w:type="spellEnd"/>
+      <w:r>
+        <w:rPr>
+          <w:lang w:val="en-US"/>
+        </w:rPr>
+        <w:t xml:space="preserve"> de Risk Configuration → Classic Risk Formula </w:t>
+      </w:r>
+      <w:r>
+        <w:t xml:space="preserve"> (ver Figuras 3 a 9).</w:t>
+      </w:r>
+    </w:p>
+    <w:p>
+      <w:pPr>
+        <w:jc w:val="center"/>
+      </w:pPr>
+      <w:r>
+        <w:rPr>
+          <w:b/>
+          <w:i w:val="0"/>
+        </w:rPr>
+        <w:t>Figura 3</w:t>
+      </w:r>
+    </w:p>
+    <w:p>
+      <w:pPr>
+        <w:jc w:val="center"/>
+      </w:pPr>
+      <w:r>
+        <w:rPr>
+          <w:b w:val="0"/>
+          <w:i/>
+        </w:rPr>
+        <w:t>Pantalla de creación de la cuenta administradora de SimpleRisk</w:t>
+      </w:r>
+    </w:p>
+    <w:p>
+      <w:pPr>
+        <w:pStyle w:val="Textoindependiente"/>
+        <w:jc w:val="center"/>
+        <w:rPr>
+          <w:lang w:val="en-US"/>
+        </w:rPr>
+      </w:pPr>
+      <w:r>
+        <w:drawing>
+          <wp:inline distT="0" distB="0" distL="0" distR="0" wp14:anchorId="597BEBF3" wp14:editId="0217AF8F">
+            <wp:extent cx="4572000" cy="2926295"/>
+            <wp:effectExtent l="0" t="0" r="0" b="0"/>
+            <wp:docPr id="5" name="Imagen 5"/>
+            <wp:cNvGraphicFramePr>
+              <a:graphicFrameLocks xmlns:a="http://schemas.openxmlformats.org/drawingml/2006/main" noChangeAspect="1"/>
+            </wp:cNvGraphicFramePr>
+            <a:graphic xmlns:a="http://schemas.openxmlformats.org/drawingml/2006/main">
+              <a:graphicData uri="http://schemas.openxmlformats.org/drawingml/2006/picture">
+                <pic:pic xmlns:pic="http://schemas.openxmlformats.org/drawingml/2006/picture">
+                  <pic:nvPicPr>
+                    <pic:cNvPr id="1" name=""/>
+                    <pic:cNvPicPr/>
+                  </pic:nvPicPr>
+                  <pic:blipFill>
+                    <a:blip r:embed="rId11"/>
+                    <a:stretch>
+                      <a:fillRect/>
+                    </a:stretch>
+                  </pic:blipFill>
+                  <pic:spPr>
+                    <a:xfrm>
+                      <a:off x="0" y="0"/>
+                      <a:ext cx="4572000" cy="2926295"/>
+                    </a:xfrm>
+                    <a:prstGeom prst="rect">
+                      <a:avLst/>
+                    </a:prstGeom>
+                  </pic:spPr>
+                </pic:pic>
+              </a:graphicData>
+            </a:graphic>
+          </wp:inline>
+        </w:drawing>
+      </w:r>
+    </w:p>
+    <w:p>
+      <w:pPr>
+        <w:jc w:val="center"/>
+      </w:pPr>
+      <w:r>
+        <w:rPr>
+          <w:i/>
+        </w:rPr>
+        <w:t xml:space="preserve">Nota. </w:t>
+      </w:r>
+      <w:r>
+        <w:t>Auditoría propia.</w:t>
+      </w:r>
+    </w:p>
+    <w:p>
+      <w:pPr>
+        <w:jc w:val="center"/>
+      </w:pPr>
+      <w:r>
+        <w:rPr>
+          <w:b/>
+          <w:i w:val="0"/>
+        </w:rPr>
+        <w:t>Figura 4</w:t>
+      </w:r>
+    </w:p>
+    <w:p>
+      <w:pPr>
+        <w:jc w:val="center"/>
+      </w:pPr>
+      <w:r>
+        <w:rPr>
+          <w:b w:val="0"/>
+          <w:i/>
+        </w:rPr>
+        <w:t>Formulario de creación de cuenta administradora completado</w:t>
+      </w:r>
+    </w:p>
+    <w:p>
+      <w:pPr>
+        <w:pStyle w:val="Textoindependiente"/>
+        <w:jc w:val="center"/>
+        <w:rPr>
+          <w:lang w:val="en-US"/>
+        </w:rPr>
+      </w:pPr>
+      <w:r>
+        <w:rPr>
+          <w:lang w:val="en-US"/>
+        </w:rPr>
+        <w:lastRenderedPageBreak/>
+        <w:drawing>
+          <wp:inline distT="0" distB="0" distL="0" distR="0" wp14:anchorId="6ABFABBD" wp14:editId="26D6E916">
+            <wp:extent cx="4572000" cy="2926295"/>
+            <wp:effectExtent l="0" t="0" r="0" b="0"/>
+            <wp:docPr id="6" name="Imagen 6"/>
+            <wp:cNvGraphicFramePr>
+              <a:graphicFrameLocks xmlns:a="http://schemas.openxmlformats.org/drawingml/2006/main" noChangeAspect="1"/>
+            </wp:cNvGraphicFramePr>
+            <a:graphic xmlns:a="http://schemas.openxmlformats.org/drawingml/2006/main">
+              <a:graphicData uri="http://schemas.openxmlformats.org/drawingml/2006/picture">
+                <pic:pic xmlns:pic="http://schemas.openxmlformats.org/drawingml/2006/picture">
+                  <pic:nvPicPr>
+                    <pic:cNvPr id="1" name=""/>
+                    <pic:cNvPicPr/>
+                  </pic:nvPicPr>
+                  <pic:blipFill>
+                    <a:blip r:embed="rId12"/>
+                    <a:stretch>
+                      <a:fillRect/>
+                    </a:stretch>
+                  </pic:blipFill>
+                  <pic:spPr>
+                    <a:xfrm>
+                      <a:off x="0" y="0"/>
+                      <a:ext cx="4572000" cy="2926295"/>
+                    </a:xfrm>
+                    <a:prstGeom prst="rect">
+                      <a:avLst/>
+                    </a:prstGeom>
+                  </pic:spPr>
+                </pic:pic>
+              </a:graphicData>
+            </a:graphic>
+          </wp:inline>
+        </w:drawing>
+      </w:r>
+    </w:p>
+    <w:p>
+      <w:pPr>
+        <w:jc w:val="center"/>
+      </w:pPr>
+      <w:r>
+        <w:rPr>
+          <w:i/>
+        </w:rPr>
+        <w:t xml:space="preserve">Nota. </w:t>
+      </w:r>
+      <w:r>
+        <w:t>Auditoría propia.</w:t>
+      </w:r>
+    </w:p>
+    <w:p>
+      <w:pPr>
+        <w:jc w:val="center"/>
+      </w:pPr>
+      <w:r>
+        <w:rPr>
+          <w:b/>
+          <w:i w:val="0"/>
+        </w:rPr>
+        <w:t>Figura 5</w:t>
+      </w:r>
+    </w:p>
+    <w:p>
+      <w:pPr>
+        <w:jc w:val="center"/>
+      </w:pPr>
+      <w:r>
+        <w:rPr>
+          <w:b w:val="0"/>
+          <w:i/>
+        </w:rPr>
+        <w:t>Pantalla de inicio de sesión de SimpleRisk</w:t>
+      </w:r>
+    </w:p>
+    <w:p>
+      <w:pPr>
+        <w:pStyle w:val="Textoindependiente"/>
+        <w:jc w:val="center"/>
+        <w:rPr>
+          <w:lang w:val="en-US"/>
+        </w:rPr>
+      </w:pPr>
+      <w:r>
+        <w:rPr>
+          <w:lang w:val="en-US"/>
+        </w:rPr>
+        <w:lastRenderedPageBreak/>
+        <w:drawing>
+          <wp:inline distT="0" distB="0" distL="0" distR="0" wp14:anchorId="6D2CA296" wp14:editId="6DB273DE">
+            <wp:extent cx="4572000" cy="2920429"/>
+            <wp:effectExtent l="0" t="0" r="0" b="0"/>
+            <wp:docPr id="7" name="Imagen 7"/>
+            <wp:cNvGraphicFramePr>
+              <a:graphicFrameLocks xmlns:a="http://schemas.openxmlformats.org/drawingml/2006/main" noChangeAspect="1"/>
+            </wp:cNvGraphicFramePr>
+            <a:graphic xmlns:a="http://schemas.openxmlformats.org/drawingml/2006/main">
+              <a:graphicData uri="http://schemas.openxmlformats.org/drawingml/2006/picture">
+                <pic:pic xmlns:pic="http://schemas.openxmlformats.org/drawingml/2006/picture">
+                  <pic:nvPicPr>
+                    <pic:cNvPr id="1" name=""/>
+                    <pic:cNvPicPr/>
+                  </pic:nvPicPr>
+                  <pic:blipFill>
+                    <a:blip r:embed="rId13"/>
+                    <a:stretch>
+                      <a:fillRect/>
+                    </a:stretch>
+                  </pic:blipFill>
+                  <pic:spPr>
+                    <a:xfrm>
+                      <a:off x="0" y="0"/>
+                      <a:ext cx="4572000" cy="2920429"/>
+                    </a:xfrm>
+                    <a:prstGeom prst="rect">
+                      <a:avLst/>
+                    </a:prstGeom>
+                  </pic:spPr>
+                </pic:pic>
+              </a:graphicData>
+            </a:graphic>
+          </wp:inline>
+        </w:drawing>
+      </w:r>
+    </w:p>
+    <w:p>
+      <w:pPr>
+        <w:jc w:val="center"/>
+      </w:pPr>
+      <w:r>
+        <w:rPr>
+          <w:i/>
+        </w:rPr>
+        <w:t xml:space="preserve">Nota. </w:t>
+      </w:r>
+      <w:r>
+        <w:t>Auditoría propia.</w:t>
+      </w:r>
+    </w:p>
+    <w:p>
+      <w:pPr>
+        <w:jc w:val="center"/>
+      </w:pPr>
+      <w:r>
+        <w:rPr>
+          <w:b/>
+          <w:i w:val="0"/>
+        </w:rPr>
+        <w:t>Figura 6</w:t>
+      </w:r>
+    </w:p>
+    <w:p>
+      <w:pPr>
+        <w:jc w:val="center"/>
+      </w:pPr>
+      <w:r>
+        <w:rPr>
+          <w:b w:val="0"/>
+          <w:i/>
+        </w:rPr>
+        <w:t>Panel de inicio (Home) de SimpleRisk</w:t>
+      </w:r>
+    </w:p>
+    <w:p>
+      <w:pPr>
+        <w:pStyle w:val="Textoindependiente"/>
+        <w:jc w:val="center"/>
+        <w:rPr>
+          <w:lang w:val="en-US"/>
+        </w:rPr>
+      </w:pPr>
+      <w:r>
+        <w:rPr>
+          <w:lang w:val="en-US"/>
+        </w:rPr>
+        <w:drawing>
+          <wp:inline distT="0" distB="0" distL="0" distR="0" wp14:anchorId="07E344A7" wp14:editId="0D080571">
+            <wp:extent cx="4572000" cy="2951711"/>
+            <wp:effectExtent l="0" t="0" r="0" b="0"/>
+            <wp:docPr id="8" name="Imagen 8"/>
+            <wp:cNvGraphicFramePr>
+              <a:graphicFrameLocks xmlns:a="http://schemas.openxmlformats.org/drawingml/2006/main" noChangeAspect="1"/>
+            </wp:cNvGraphicFramePr>
+            <a:graphic xmlns:a="http://schemas.openxmlformats.org/drawingml/2006/main">
+              <a:graphicData uri="http://schemas.openxmlformats.org/drawingml/2006/picture">
+                <pic:pic xmlns:pic="http://schemas.openxmlformats.org/drawingml/2006/picture">
+                  <pic:nvPicPr>
+                    <pic:cNvPr id="1" name=""/>
+                    <pic:cNvPicPr/>
+                  </pic:nvPicPr>
+                  <pic:blipFill>
+                    <a:blip r:embed="rId14"/>
+                    <a:stretch>
+                      <a:fillRect/>
+                    </a:stretch>
+                  </pic:blipFill>
+                  <pic:spPr>
+                    <a:xfrm>
+                      <a:off x="0" y="0"/>
+                      <a:ext cx="4572000" cy="2951711"/>
+                    </a:xfrm>
+                    <a:prstGeom prst="rect">
+                      <a:avLst/>
+                    </a:prstGeom>
+                  </pic:spPr>
+                </pic:pic>
+              </a:graphicData>
+            </a:graphic>
+          </wp:inline>
+        </w:drawing>
+      </w:r>
+    </w:p>
+    <w:p>
+      <w:pPr>
+        <w:jc w:val="center"/>
+      </w:pPr>
+      <w:r>
+        <w:rPr>
+          <w:i/>
+        </w:rPr>
+        <w:t xml:space="preserve">Nota. </w:t>
+      </w:r>
+      <w:r>
+        <w:t>Auditoría propia.</w:t>
+      </w:r>
+    </w:p>
+    <w:p>
+      <w:pPr>
+        <w:jc w:val="center"/>
+      </w:pPr>
+      <w:r>
+        <w:rPr>
+          <w:b/>
+          <w:i w:val="0"/>
+        </w:rPr>
+        <w:t>Figura 7</w:t>
+      </w:r>
+    </w:p>
+    <w:p>
+      <w:pPr>
+        <w:jc w:val="center"/>
+      </w:pPr>
+      <w:r>
+        <w:rPr>
+          <w:b w:val="0"/>
+          <w:i/>
+        </w:rPr>
+        <w:t>Panel de configuración (Settings) de SimpleRisk</w:t>
+      </w:r>
+    </w:p>
+    <w:p>
+      <w:pPr>
+        <w:pStyle w:val="Textoindependiente"/>
+        <w:jc w:val="center"/>
+        <w:rPr>
+          <w:lang w:val="en-US"/>
+        </w:rPr>
+      </w:pPr>
+      <w:r>
+        <w:rPr>
+          <w:lang w:val="en-US"/>
+        </w:rPr>
+        <w:lastRenderedPageBreak/>
+        <w:drawing>
+          <wp:inline distT="0" distB="0" distL="0" distR="0" wp14:anchorId="63455E90" wp14:editId="4B1A62F1">
+            <wp:extent cx="4572000" cy="2903811"/>
+            <wp:effectExtent l="0" t="0" r="0" b="0"/>
+            <wp:docPr id="9" name="Imagen 9"/>
+            <wp:cNvGraphicFramePr>
+              <a:graphicFrameLocks xmlns:a="http://schemas.openxmlformats.org/drawingml/2006/main" noChangeAspect="1"/>
+            </wp:cNvGraphicFramePr>
+            <a:graphic xmlns:a="http://schemas.openxmlformats.org/drawingml/2006/main">
+              <a:graphicData uri="http://schemas.openxmlformats.org/drawingml/2006/picture">
+                <pic:pic xmlns:pic="http://schemas.openxmlformats.org/drawingml/2006/picture">
+                  <pic:nvPicPr>
+                    <pic:cNvPr id="1" name=""/>
+                    <pic:cNvPicPr/>
+                  </pic:nvPicPr>
+                  <pic:blipFill>
+                    <a:blip r:embed="rId15"/>
+                    <a:stretch>
+                      <a:fillRect/>
+                    </a:stretch>
+                  </pic:blipFill>
+                  <pic:spPr>
+                    <a:xfrm>
+                      <a:off x="0" y="0"/>
+                      <a:ext cx="4572000" cy="2903811"/>
+                    </a:xfrm>
+                    <a:prstGeom prst="rect">
+                      <a:avLst/>
+                    </a:prstGeom>
+                  </pic:spPr>
+                </pic:pic>
+              </a:graphicData>
+            </a:graphic>
+          </wp:inline>
+        </w:drawing>
+      </w:r>
+    </w:p>
+    <w:p>
+      <w:pPr>
+        <w:jc w:val="center"/>
+      </w:pPr>
+      <w:r>
+        <w:rPr>
+          <w:i/>
+        </w:rPr>
+        <w:t xml:space="preserve">Nota. </w:t>
+      </w:r>
+      <w:r>
+        <w:t>Auditoría propia.</w:t>
+      </w:r>
+    </w:p>
+    <w:p>
+      <w:pPr>
+        <w:jc w:val="center"/>
+      </w:pPr>
+      <w:r>
+        <w:rPr>
+          <w:b/>
+          <w:i w:val="0"/>
+        </w:rPr>
+        <w:t>Figura 8</w:t>
+      </w:r>
+    </w:p>
+    <w:p>
+      <w:pPr>
+        <w:jc w:val="center"/>
+      </w:pPr>
+      <w:r>
+        <w:rPr>
+          <w:b w:val="0"/>
+          <w:i/>
+        </w:rPr>
+        <w:t>Pestaña Scoring de la configuración de riesgos</w:t>
+      </w:r>
+    </w:p>
+    <w:p>
+      <w:pPr>
+        <w:pStyle w:val="Textoindependiente"/>
+        <w:jc w:val="center"/>
+        <w:rPr>
+          <w:lang w:val="en-US"/>
+        </w:rPr>
+      </w:pPr>
+      <w:r>
+        <w:rPr>
+          <w:lang w:val="en-US"/>
+        </w:rPr>
+        <w:drawing>
+          <wp:inline distT="0" distB="0" distL="0" distR="0" wp14:anchorId="3D0D3775" wp14:editId="54B8E69D">
+            <wp:extent cx="4572000" cy="2916519"/>
+            <wp:effectExtent l="0" t="0" r="0" b="0"/>
+            <wp:docPr id="11" name="Imagen 11"/>
+            <wp:cNvGraphicFramePr>
+              <a:graphicFrameLocks xmlns:a="http://schemas.openxmlformats.org/drawingml/2006/main" noChangeAspect="1"/>
+            </wp:cNvGraphicFramePr>
+            <a:graphic xmlns:a="http://schemas.openxmlformats.org/drawingml/2006/main">
+              <a:graphicData uri="http://schemas.openxmlformats.org/drawingml/2006/picture">
+                <pic:pic xmlns:pic="http://schemas.openxmlformats.org/drawingml/2006/picture">
+                  <pic:nvPicPr>
+                    <pic:cNvPr id="1" name=""/>
+                    <pic:cNvPicPr/>
+                  </pic:nvPicPr>
+                  <pic:blipFill>
+                    <a:blip r:embed="rId16"/>
+                    <a:stretch>
+                      <a:fillRect/>
+                    </a:stretch>
+                  </pic:blipFill>
+                  <pic:spPr>
+                    <a:xfrm>
+                      <a:off x="0" y="0"/>
+                      <a:ext cx="4572000" cy="2916519"/>
+                    </a:xfrm>
+                    <a:prstGeom prst="rect">
+                      <a:avLst/>
+                    </a:prstGeom>
+                  </pic:spPr>
+                </pic:pic>
+              </a:graphicData>
+            </a:graphic>
+          </wp:inline>
+        </w:drawing>
+      </w:r>
+    </w:p>
+    <w:p>
+      <w:pPr>
+        <w:jc w:val="center"/>
+      </w:pPr>
+      <w:r>
+        <w:rPr>
+          <w:i/>
+        </w:rPr>
+        <w:t xml:space="preserve">Nota. </w:t>
+      </w:r>
+      <w:r>
+        <w:t>Auditoría propia.</w:t>
+      </w:r>
+    </w:p>
+    <w:p>
+      <w:pPr>
+        <w:jc w:val="center"/>
+      </w:pPr>
+      <w:r>
+        <w:rPr>
+          <w:b/>
+          <w:i w:val="0"/>
+        </w:rPr>
+        <w:t>Figura 9</w:t>
+      </w:r>
+    </w:p>
+    <w:p>
+      <w:pPr>
+        <w:jc w:val="center"/>
+      </w:pPr>
+      <w:r>
+        <w:rPr>
+          <w:b w:val="0"/>
+          <w:i/>
+        </w:rPr>
+        <w:t>Fórmula clásica de riesgo (Likelihood x Impact) con escalas operativas definidas</w:t>
+      </w:r>
+    </w:p>
+    <w:p>
+      <w:pPr>
+        <w:pStyle w:val="Textoindependiente"/>
+        <w:jc w:val="center"/>
+        <w:rPr>
+          <w:lang w:val="en-US"/>
+        </w:rPr>
+      </w:pPr>
+      <w:r>
+        <w:rPr>
+          <w:lang w:val="en-US"/>
+        </w:rPr>
+        <w:lastRenderedPageBreak/>
+        <w:drawing>
+          <wp:inline distT="0" distB="0" distL="0" distR="0" wp14:anchorId="3E2B529F" wp14:editId="12969E63">
+            <wp:extent cx="4572000" cy="4572000"/>
+            <wp:effectExtent l="0" t="0" r="0" b="0"/>
+            <wp:docPr id="12" name="Imagen 12"/>
+            <wp:cNvGraphicFramePr>
+              <a:graphicFrameLocks xmlns:a="http://schemas.openxmlformats.org/drawingml/2006/main" noChangeAspect="1"/>
+            </wp:cNvGraphicFramePr>
+            <a:graphic xmlns:a="http://schemas.openxmlformats.org/drawingml/2006/main">
+              <a:graphicData uri="http://schemas.openxmlformats.org/drawingml/2006/picture">
+                <pic:pic xmlns:pic="http://schemas.openxmlformats.org/drawingml/2006/picture">
+                  <pic:nvPicPr>
+                    <pic:cNvPr id="1" name=""/>
+                    <pic:cNvPicPr/>
+                  </pic:nvPicPr>
+                  <pic:blipFill>
+                    <a:blip r:embed="rId17"/>
+                    <a:stretch>
+                      <a:fillRect/>
+                    </a:stretch>
+                  </pic:blipFill>
+                  <pic:spPr>
+                    <a:xfrm>
+                      <a:off x="0" y="0"/>
+                      <a:ext cx="4572000" cy="4572000"/>
+                    </a:xfrm>
+                    <a:prstGeom prst="rect">
+                      <a:avLst/>
+                    </a:prstGeom>
+                  </pic:spPr>
+                </pic:pic>
+              </a:graphicData>
+            </a:graphic>
+          </wp:inline>
+        </w:drawing>
+      </w:r>
+    </w:p>
+    <w:p>
+      <w:pPr>
+        <w:jc w:val="center"/>
+      </w:pPr>
+      <w:r>
+        <w:rPr>
+          <w:i/>
+        </w:rPr>
+        <w:t xml:space="preserve">Nota. </w:t>
+      </w:r>
+      <w:r>
+        <w:t>Auditoría propia.</w:t>
+      </w:r>
+    </w:p>
+    <w:p>
+      <w:pPr>
+        <w:pStyle w:val="Textoindependiente"/>
+        <w:rPr>
+          <w:lang w:val="en-US"/>
+        </w:rPr>
+      </w:pPr>
     </w:p>
     <w:p>
       <w:pPr>
         <w:pStyle w:val="Ttulo2"/>
       </w:pPr>
-      <w:bookmarkStart w:id="22" w:name="_Toc239258954"/>
-      <w:bookmarkStart w:id="23" w:name="paso-c"/>
-      <w:bookmarkEnd w:id="21"/>
+      <w:bookmarkStart w:id="22" w:name="paso-c"/>
+      <w:bookmarkStart w:id="23" w:name="_Toc239261501"/>
+      <w:bookmarkEnd w:id="20"/>
       <w:r>
         <w:t>Paso C</w:t>
       </w:r>
-      <w:bookmarkEnd w:id="22"/>
+      <w:bookmarkEnd w:id="23"/>
     </w:p>
     <w:p>
       <w:pPr>
@@ -2295,10 +3244,7 @@
         <w:ind w:left="720"/>
       </w:pPr>
       <w:r>
-        <w:t>Objetivo: identificar la subred del laboratorio y ejecutar el escaneo de vuln</w:t>
-      </w:r>
-      <w:r>
-        <w:t>erabilidades sobre los objetivos autorizados.</w:t>
+        <w:t>Objetivo: identificar la subred del laboratorio y ejecutar el escaneo de vulnerabilidades sobre los objetivos autorizados.</w:t>
       </w:r>
     </w:p>
     <w:p>
@@ -2307,10 +3253,7 @@
         <w:ind w:left="720"/>
       </w:pPr>
       <w:r>
-        <w:t>Se identificó la subred de audit_net (172.18.0.0/16) y las IP de los cuatro contenedores objetivo con docker network inspect y docker inspect; la lista quedó registrada en 20_evidencia/E03_scan/objetivos.txt (s</w:t>
-      </w:r>
-      <w:r>
-        <w:t>i084_dvwa 172.18.0.2, si084_juiceshop 172.18.0.3, si084_portal 172.18.0.4, si084_db 172.18.0.5).</w:t>
+        <w:t>Se identificó la subred de audit_net (172.18.0.0/16) y las IP de los cuatro contenedores objetivo con docker network inspect y docker inspect; la lista quedó registrada en 20_evidencia/E03_scan/objetivos.txt (si084_dvwa 172.18.0.2, si084_juiceshop 172.18.0.3, si084_portal 172.18.0.4, si084_db 172.18.0.5).</w:t>
       </w:r>
     </w:p>
     <w:p>
@@ -2319,10 +3262,7 @@
         <w:ind w:left="720"/>
       </w:pPr>
       <w:r>
-        <w:t>En Greenbone se creó el objetivo si084-lab-audit_net (los 4 hosts, puertos All IANA assigned TCP), una credencial de laboratorio para el intento de escaneo aut</w:t>
-      </w:r>
-      <w:r>
-        <w:t>enticado sobre si084_db, y la tarea E03-Escaneo-si084-lab con la configuración Full and fast, usando el protocolo GMP (gvm-tools / python-gvm) en lugar de la interfaz web, por mayor fiabilidad al automatizar el laboratorio.</w:t>
+        <w:t>En Greenbone se creó el objetivo si084-lab-audit_net (los 4 hosts, puertos All IANA assigned TCP), una credencial de laboratorio para el intento de escaneo autenticado sobre si084_db, y la tarea E03-Escaneo-si084-lab con la configuración Full and fast, usando el protocolo GMP (gvm-tools / python-gvm) en lugar de la interfaz web, por mayor fiabilidad al automatizar el laboratorio.</w:t>
       </w:r>
     </w:p>
     <w:p>
@@ -2332,13 +3272,7 @@
       </w:pPr>
       <w:r>
         <w:lastRenderedPageBreak/>
-        <w:t>Hallazgo de configuración: la pr</w:t>
-      </w:r>
-      <w:r>
-        <w:t>imera ejecución de la tarea terminó en 0 segundos con 0 resultados. La causa fue que el contenedor escáner de Greenbone (ospd-openvas/openvas) pertenece a su propia red Docker (creada por su docker-compose) y no estaba unido a audit_net, por lo que no podí</w:t>
-      </w:r>
-      <w:r>
-        <w:t>a enrutar hacia los objetivos. Se corrigió con docker network connect audit_net &lt;contenedor-escaner&gt; y se relanzó la tarea.</w:t>
+        <w:t>Hallazgo de configuración: la primera ejecución de la tarea terminó en 0 segundos con 0 resultados. La causa fue que el contenedor escáner de Greenbone (ospd-openvas/openvas) pertenece a su propia red Docker (creada por su docker-compose) y no estaba unido a audit_net, por lo que no podía enrutar hacia los objetivos. Se corrigió con docker network connect audit_net &lt;contenedor-escaner&gt; y se relanzó la tarea.</w:t>
       </w:r>
     </w:p>
     <w:p>
@@ -2347,10 +3281,7 @@
         <w:ind w:left="720"/>
       </w:pPr>
       <w:r>
-        <w:t>En paralelo se ejecutó el reconocimiento manual: docker run --rm --network audit_net instrumentisto/nmap -sV -sC -p- --open 172.18.0</w:t>
-      </w:r>
-      <w:r>
-        <w:t>.0/28</w:t>
+        <w:t>En paralelo se ejecutó el reconocimiento manual: docker run --rm --network audit_net instrumentisto/nmap -sV -sC -p- --open 172.18.0.0/28</w:t>
       </w:r>
     </w:p>
     <w:p>
@@ -2370,14 +3301,105 @@
       <w:r>
         <w:t xml:space="preserve">Evidencia: listado de objetivos, reportes CSV/XML y salida de nmap — </w:t>
       </w:r>
+      <w:r>
+        <w:t xml:space="preserve"> (ver Figura 10).</w:t>
+      </w:r>
+    </w:p>
+    <w:p>
+      <w:pPr>
+        <w:jc w:val="center"/>
+      </w:pPr>
+      <w:r>
+        <w:rPr>
+          <w:b/>
+          <w:i w:val="0"/>
+        </w:rPr>
+        <w:t>Figura 10</w:t>
+      </w:r>
+    </w:p>
+    <w:p>
+      <w:pPr>
+        <w:jc w:val="center"/>
+      </w:pPr>
+      <w:r>
+        <w:rPr>
+          <w:b w:val="0"/>
+          <w:i/>
+        </w:rPr>
+        <w:t>Carpeta de evidencia del escaneo (20_evidencia/E03_scan)</w:t>
+      </w:r>
+    </w:p>
+    <w:p>
+      <w:pPr>
+        <w:pStyle w:val="Textoindependiente"/>
+        <w:jc w:val="center"/>
+      </w:pPr>
+      <w:r>
+        <w:drawing>
+          <wp:inline distT="0" distB="0" distL="0" distR="0" wp14:anchorId="7DCF1131" wp14:editId="60FB8160">
+            <wp:extent cx="4572000" cy="1720487"/>
+            <wp:effectExtent l="0" t="0" r="0" b="0"/>
+            <wp:docPr id="14" name="Imagen 14"/>
+            <wp:cNvGraphicFramePr>
+              <a:graphicFrameLocks xmlns:a="http://schemas.openxmlformats.org/drawingml/2006/main" noChangeAspect="1"/>
+            </wp:cNvGraphicFramePr>
+            <a:graphic xmlns:a="http://schemas.openxmlformats.org/drawingml/2006/main">
+              <a:graphicData uri="http://schemas.openxmlformats.org/drawingml/2006/picture">
+                <pic:pic xmlns:pic="http://schemas.openxmlformats.org/drawingml/2006/picture">
+                  <pic:nvPicPr>
+                    <pic:cNvPr id="1" name=""/>
+                    <pic:cNvPicPr/>
+                  </pic:nvPicPr>
+                  <pic:blipFill>
+                    <a:blip r:embed="rId18"/>
+                    <a:stretch>
+                      <a:fillRect/>
+                    </a:stretch>
+                  </pic:blipFill>
+                  <pic:spPr>
+                    <a:xfrm>
+                      <a:off x="0" y="0"/>
+                      <a:ext cx="4572000" cy="1720487"/>
+                    </a:xfrm>
+                    <a:prstGeom prst="rect">
+                      <a:avLst/>
+                    </a:prstGeom>
+                  </pic:spPr>
+                </pic:pic>
+              </a:graphicData>
+            </a:graphic>
+          </wp:inline>
+        </w:drawing>
+      </w:r>
+    </w:p>
+    <w:p>
+      <w:pPr>
+        <w:jc w:val="center"/>
+      </w:pPr>
+      <w:r>
+        <w:rPr>
+          <w:i/>
+        </w:rPr>
+        <w:t xml:space="preserve">Nota. </w:t>
+      </w:r>
+      <w:r>
+        <w:t>Auditoría propia.</w:t>
+      </w:r>
+    </w:p>
+    <w:p>
+      <w:pPr>
+        <w:pStyle w:val="Textoindependiente"/>
+      </w:pPr>
     </w:p>
     <w:p>
       <w:pPr>
         <w:pStyle w:val="Ttulo2"/>
       </w:pPr>
+      <w:bookmarkStart w:id="24" w:name="_Toc239261502"/>
       <w:r>
         <w:t>Paso D</w:t>
       </w:r>
+      <w:bookmarkEnd w:id="24"/>
     </w:p>
     <w:p>
       <w:pPr>
@@ -2385,10 +3407,7 @@
         <w:ind w:left="720"/>
       </w:pPr>
       <w:r>
-        <w:t xml:space="preserve">Objetivo: convertir los </w:t>
-      </w:r>
-      <w:r>
-        <w:t>hallazgos técnicos del escáner en riesgos de negocio, incorporando el contexto de cada activo (dueño, clasificación, exposición y criticidad).</w:t>
+        <w:t>Objetivo: convertir los hallazgos técnicos del escáner en riesgos de negocio, incorporando el contexto de cada activo (dueño, clasificación, exposición y criticidad).</w:t>
       </w:r>
     </w:p>
     <w:p>
@@ -2397,10 +3416,7 @@
         <w:ind w:left="720"/>
       </w:pPr>
       <w:r>
-        <w:t>El script 30_papeles_trabajo/PT03_tecnico_a_riesgo.py lee reporte_greenbone.csv, descarta los hallazgos informati</w:t>
-      </w:r>
-      <w:r>
-        <w:t>vos (Severity &lt; 4.0) y cruza cada uno con el diccionario ACTIVOS (activo, dueño, clasificación, exposición a Internet, criticidad de negocio 1-5), aplicando las funciones probabilidad() e impacto() definidas en PT03_criterio_evaluacion.md.</w:t>
+        <w:t>El script 30_papeles_trabajo/PT03_tecnico_a_riesgo.py lee reporte_greenbone.csv, descarta los hallazgos informativos (Severity &lt; 4.0) y cruza cada uno con el diccionario ACTIVOS (activo, dueño, clasificación, exposición a Internet, criticidad de negocio 1-5), aplicando las funciones probabilidad() e impacto() definidas en PT03_criterio_evaluacion.md.</w:t>
       </w:r>
     </w:p>
     <w:p>
@@ -2409,10 +3425,7 @@
         <w:ind w:left="720"/>
       </w:pPr>
       <w:r>
-        <w:t>Salida: 40_halla</w:t>
-      </w:r>
-      <w:r>
-        <w:t>zgos/PT03_registro_riesgos.csv, con id_riesgo, activo, dueño, CVE, CVSS, probabilidad, impacto, riesgo inherente y nivel.</w:t>
+        <w:t>Salida: 40_hallazgos/PT03_registro_riesgos.csv, con id_riesgo, activo, dueño, CVE, CVSS, probabilidad, impacto, riesgo inherente y nivel.</w:t>
       </w:r>
     </w:p>
     <w:p>
@@ -2423,14 +3436,101 @@
       <w:r>
         <w:t xml:space="preserve">Evidencia: contenido del CSV </w:t>
       </w:r>
+      <w:r>
+        <w:t xml:space="preserve"> (ver Figura 11).</w:t>
+      </w:r>
+    </w:p>
+    <w:p>
+      <w:pPr>
+        <w:jc w:val="center"/>
+      </w:pPr>
+      <w:r>
+        <w:rPr>
+          <w:b/>
+          <w:i w:val="0"/>
+        </w:rPr>
+        <w:t>Figura 11</w:t>
+      </w:r>
+    </w:p>
+    <w:p>
+      <w:pPr>
+        <w:jc w:val="center"/>
+      </w:pPr>
+      <w:r>
+        <w:rPr>
+          <w:b w:val="0"/>
+          <w:i/>
+        </w:rPr>
+        <w:t>Carpeta del registro de riesgos (40_hallazgos)</w:t>
+      </w:r>
+    </w:p>
+    <w:p>
+      <w:pPr>
+        <w:pStyle w:val="Textoindependiente"/>
+        <w:jc w:val="center"/>
+      </w:pPr>
+      <w:r>
+        <w:drawing>
+          <wp:inline distT="0" distB="0" distL="0" distR="0" wp14:anchorId="5BA08C90" wp14:editId="5E48E81D">
+            <wp:extent cx="4572000" cy="1522044"/>
+            <wp:effectExtent l="0" t="0" r="0" b="0"/>
+            <wp:docPr id="15" name="Imagen 15"/>
+            <wp:cNvGraphicFramePr>
+              <a:graphicFrameLocks xmlns:a="http://schemas.openxmlformats.org/drawingml/2006/main" noChangeAspect="1"/>
+            </wp:cNvGraphicFramePr>
+            <a:graphic xmlns:a="http://schemas.openxmlformats.org/drawingml/2006/main">
+              <a:graphicData uri="http://schemas.openxmlformats.org/drawingml/2006/picture">
+                <pic:pic xmlns:pic="http://schemas.openxmlformats.org/drawingml/2006/picture">
+                  <pic:nvPicPr>
+                    <pic:cNvPr id="1" name=""/>
+                    <pic:cNvPicPr/>
+                  </pic:nvPicPr>
+                  <pic:blipFill>
+                    <a:blip r:embed="rId19"/>
+                    <a:stretch>
+                      <a:fillRect/>
+                    </a:stretch>
+                  </pic:blipFill>
+                  <pic:spPr>
+                    <a:xfrm>
+                      <a:off x="0" y="0"/>
+                      <a:ext cx="4572000" cy="1522044"/>
+                    </a:xfrm>
+                    <a:prstGeom prst="rect">
+                      <a:avLst/>
+                    </a:prstGeom>
+                  </pic:spPr>
+                </pic:pic>
+              </a:graphicData>
+            </a:graphic>
+          </wp:inline>
+        </w:drawing>
+      </w:r>
+    </w:p>
+    <w:p>
+      <w:pPr>
+        <w:jc w:val="center"/>
+      </w:pPr>
+      <w:r>
+        <w:rPr>
+          <w:i/>
+        </w:rPr>
+        <w:t xml:space="preserve">Nota. </w:t>
+      </w:r>
+      <w:r>
+        <w:t>Auditoría propia.</w:t>
+      </w:r>
     </w:p>
     <w:p>
       <w:pPr>
         <w:pStyle w:val="Ttulo2"/>
       </w:pPr>
-      <w:r>
+      <w:bookmarkStart w:id="25" w:name="_Toc239261503"/>
+      <w:r>
+        <w:lastRenderedPageBreak/>
         <w:t>Paso E</w:t>
       </w:r>
+      <w:bookmarkEnd w:id="25"/>
     </w:p>
     <w:p>
       <w:pPr>
@@ -2438,10 +3538,7 @@
         <w:ind w:left="720"/>
       </w:pPr>
       <w:r>
-        <w:t xml:space="preserve">Objetivo: tratar los cinco riesgos de mayor valor en </w:t>
-      </w:r>
-      <w:r>
-        <w:t>SimpleRisk y elaborar el extracto de la Declaración de Aplicabilidad (SoA).</w:t>
+        <w:t>Objetivo: tratar los cinco riesgos de mayor valor en SimpleRisk y elaborar el extracto de la Declaración de Aplicabilidad (SoA).</w:t>
       </w:r>
     </w:p>
     <w:p>
@@ -2459,10 +3556,7 @@
         <w:ind w:left="720"/>
       </w:pPr>
       <w:r>
-        <w:t>Para ca</w:t>
-      </w:r>
-      <w:r>
-        <w:t>da uno se definió la decisión de tratamiento (Plan Your Mitigations), se estimó el riesgo residual y se identificó a quién corresponde firmar la aceptación.</w:t>
+        <w:t>Para cada uno se definió la decisión de tratamiento (Plan Your Mitigations), se estimó el riesgo residual y se identificó a quién corresponde firmar la aceptación.</w:t>
       </w:r>
     </w:p>
     <w:p>
@@ -2471,10 +3565,7 @@
         <w:ind w:left="720"/>
       </w:pPr>
       <w:r>
-        <w:t>Cada control de mitigación se mapeó a su código del Anexo A de ISO/IEC 27001:2022 en 30_papeles_tra</w:t>
-      </w:r>
-      <w:r>
-        <w:t>bajo/PT03_soa_extracto.md.</w:t>
+        <w:t>Cada control de mitigación se mapeó a su código del Anexo A de ISO/IEC 27001:2022 en 30_papeles_trabajo/PT03_soa_extracto.md.</w:t>
       </w:r>
     </w:p>
     <w:p>
@@ -2483,33 +3574,286 @@
         <w:ind w:left="720"/>
       </w:pPr>
       <w:r>
-        <w:t>Evidencia: capturas de SimpleRisk y el archivo PT03_soa_extracto.</w:t>
-      </w:r>
-      <w:r>
-        <w:t xml:space="preserve">md </w:t>
-      </w:r>
-      <w:bookmarkStart w:id="24" w:name="_GoBack"/>
-      <w:bookmarkEnd w:id="24"/>
+        <w:t xml:space="preserve">Evidencia: capturas de SimpleRisk y el archivo PT03_soa_extracto.md </w:t>
+      </w:r>
+      <w:r>
+        <w:t xml:space="preserve"> (ver Figuras 12 a 14).</w:t>
+      </w:r>
+    </w:p>
+    <w:p>
+      <w:pPr>
+        <w:jc w:val="center"/>
+      </w:pPr>
+      <w:r>
+        <w:rPr>
+          <w:b/>
+          <w:i w:val="0"/>
+        </w:rPr>
+        <w:t>Figura 12</w:t>
+      </w:r>
+    </w:p>
+    <w:p>
+      <w:pPr>
+        <w:jc w:val="center"/>
+      </w:pPr>
+      <w:r>
+        <w:rPr>
+          <w:b w:val="0"/>
+          <w:i/>
+        </w:rPr>
+        <w:t>Gestión de usuarios (dueños de riesgo) en SimpleRisk</w:t>
+      </w:r>
+    </w:p>
+    <w:p>
+      <w:pPr>
+        <w:pStyle w:val="Textoindependiente"/>
+        <w:jc w:val="center"/>
+      </w:pPr>
+      <w:r>
+        <w:lastRenderedPageBreak/>
+        <w:drawing>
+          <wp:inline distT="0" distB="0" distL="0" distR="0" wp14:anchorId="044204CF" wp14:editId="059C5DEE">
+            <wp:extent cx="4572000" cy="4581775"/>
+            <wp:effectExtent l="0" t="0" r="0" b="0"/>
+            <wp:docPr id="16" name="Imagen 16"/>
+            <wp:cNvGraphicFramePr>
+              <a:graphicFrameLocks xmlns:a="http://schemas.openxmlformats.org/drawingml/2006/main" noChangeAspect="1"/>
+            </wp:cNvGraphicFramePr>
+            <a:graphic xmlns:a="http://schemas.openxmlformats.org/drawingml/2006/main">
+              <a:graphicData uri="http://schemas.openxmlformats.org/drawingml/2006/picture">
+                <pic:pic xmlns:pic="http://schemas.openxmlformats.org/drawingml/2006/picture">
+                  <pic:nvPicPr>
+                    <pic:cNvPr id="1" name=""/>
+                    <pic:cNvPicPr/>
+                  </pic:nvPicPr>
+                  <pic:blipFill>
+                    <a:blip r:embed="rId20"/>
+                    <a:stretch>
+                      <a:fillRect/>
+                    </a:stretch>
+                  </pic:blipFill>
+                  <pic:spPr>
+                    <a:xfrm>
+                      <a:off x="0" y="0"/>
+                      <a:ext cx="4572000" cy="4581775"/>
+                    </a:xfrm>
+                    <a:prstGeom prst="rect">
+                      <a:avLst/>
+                    </a:prstGeom>
+                  </pic:spPr>
+                </pic:pic>
+              </a:graphicData>
+            </a:graphic>
+          </wp:inline>
+        </w:drawing>
+      </w:r>
+      <w:bookmarkStart w:id="26" w:name="_GoBack"/>
+      <w:bookmarkEnd w:id="26"/>
+    </w:p>
+    <w:p>
+      <w:pPr>
+        <w:jc w:val="center"/>
+      </w:pPr>
+      <w:r>
+        <w:rPr>
+          <w:i/>
+        </w:rPr>
+        <w:t xml:space="preserve">Nota. </w:t>
+      </w:r>
+      <w:r>
+        <w:t>Auditoría propia.</w:t>
+      </w:r>
+    </w:p>
+    <w:p>
+      <w:pPr>
+        <w:jc w:val="center"/>
+      </w:pPr>
+      <w:r>
+        <w:rPr>
+          <w:b/>
+          <w:i w:val="0"/>
+        </w:rPr>
+        <w:t>Figura 13</w:t>
+      </w:r>
+    </w:p>
+    <w:p>
+      <w:pPr>
+        <w:jc w:val="center"/>
+      </w:pPr>
+      <w:r>
+        <w:rPr>
+          <w:b w:val="0"/>
+          <w:i/>
+        </w:rPr>
+        <w:t>Formulario de registro del riesgo R-011 en SimpleRisk</w:t>
+      </w:r>
+    </w:p>
+    <w:p>
+      <w:pPr>
+        <w:pStyle w:val="Textoindependiente"/>
+        <w:jc w:val="center"/>
+      </w:pPr>
+      <w:bookmarkStart w:id="26" w:name="_GoBack"/>
+      <w:bookmarkEnd w:id="26"/>
+      <w:r>
+        <w:lastRenderedPageBreak/>
+        <w:drawing>
+          <wp:inline distT="0" distB="0" distL="0" distR="0" wp14:anchorId="24533093" wp14:editId="6BE2F405">
+            <wp:extent cx="4572000" cy="5205452"/>
+            <wp:effectExtent l="0" t="0" r="0" b="0"/>
+            <wp:docPr id="17" name="Imagen 17"/>
+            <wp:cNvGraphicFramePr>
+              <a:graphicFrameLocks xmlns:a="http://schemas.openxmlformats.org/drawingml/2006/main" noChangeAspect="1"/>
+            </wp:cNvGraphicFramePr>
+            <a:graphic xmlns:a="http://schemas.openxmlformats.org/drawingml/2006/main">
+              <a:graphicData uri="http://schemas.openxmlformats.org/drawingml/2006/picture">
+                <pic:pic xmlns:pic="http://schemas.openxmlformats.org/drawingml/2006/picture">
+                  <pic:nvPicPr>
+                    <pic:cNvPr id="1" name=""/>
+                    <pic:cNvPicPr/>
+                  </pic:nvPicPr>
+                  <pic:blipFill>
+                    <a:blip r:embed="rId21"/>
+                    <a:stretch>
+                      <a:fillRect/>
+                    </a:stretch>
+                  </pic:blipFill>
+                  <pic:spPr>
+                    <a:xfrm>
+                      <a:off x="0" y="0"/>
+                      <a:ext cx="4572000" cy="5205452"/>
+                    </a:xfrm>
+                    <a:prstGeom prst="rect">
+                      <a:avLst/>
+                    </a:prstGeom>
+                  </pic:spPr>
+                </pic:pic>
+              </a:graphicData>
+            </a:graphic>
+          </wp:inline>
+        </w:drawing>
+      </w:r>
+    </w:p>
+    <w:p>
+      <w:pPr>
+        <w:jc w:val="center"/>
+      </w:pPr>
+      <w:r>
+        <w:rPr>
+          <w:i/>
+        </w:rPr>
+        <w:t xml:space="preserve">Nota. </w:t>
+      </w:r>
+      <w:r>
+        <w:t>Auditoría propia.</w:t>
+      </w:r>
+    </w:p>
+    <w:p>
+      <w:pPr>
+        <w:jc w:val="center"/>
+      </w:pPr>
+      <w:r>
+        <w:rPr>
+          <w:b/>
+          <w:i w:val="0"/>
+        </w:rPr>
+        <w:t>Figura 14</w:t>
+      </w:r>
+    </w:p>
+    <w:p>
+      <w:pPr>
+        <w:jc w:val="center"/>
+      </w:pPr>
+      <w:r>
+        <w:rPr>
+          <w:b w:val="0"/>
+          <w:i/>
+        </w:rPr>
+        <w:t>Panel de planificación de mitigación sin riesgos pendientes</w:t>
+      </w:r>
+    </w:p>
+    <w:p>
+      <w:pPr>
+        <w:pStyle w:val="Textoindependiente"/>
+        <w:jc w:val="center"/>
+      </w:pPr>
+      <w:bookmarkStart w:id="26" w:name="_GoBack"/>
+      <w:bookmarkEnd w:id="26"/>
+      <w:r>
+        <w:lastRenderedPageBreak/>
+        <w:drawing>
+          <wp:inline distT="0" distB="0" distL="0" distR="0" wp14:anchorId="1B3F547C" wp14:editId="4AFDB4DF">
+            <wp:extent cx="4572000" cy="5187856"/>
+            <wp:effectExtent l="0" t="0" r="0" b="0"/>
+            <wp:docPr id="18" name="Imagen 18"/>
+            <wp:cNvGraphicFramePr>
+              <a:graphicFrameLocks xmlns:a="http://schemas.openxmlformats.org/drawingml/2006/main" noChangeAspect="1"/>
+            </wp:cNvGraphicFramePr>
+            <a:graphic xmlns:a="http://schemas.openxmlformats.org/drawingml/2006/main">
+              <a:graphicData uri="http://schemas.openxmlformats.org/drawingml/2006/picture">
+                <pic:pic xmlns:pic="http://schemas.openxmlformats.org/drawingml/2006/picture">
+                  <pic:nvPicPr>
+                    <pic:cNvPr id="1" name=""/>
+                    <pic:cNvPicPr/>
+                  </pic:nvPicPr>
+                  <pic:blipFill>
+                    <a:blip r:embed="rId22"/>
+                    <a:stretch>
+                      <a:fillRect/>
+                    </a:stretch>
+                  </pic:blipFill>
+                  <pic:spPr>
+                    <a:xfrm>
+                      <a:off x="0" y="0"/>
+                      <a:ext cx="4572000" cy="5187856"/>
+                    </a:xfrm>
+                    <a:prstGeom prst="rect">
+                      <a:avLst/>
+                    </a:prstGeom>
+                  </pic:spPr>
+                </pic:pic>
+              </a:graphicData>
+            </a:graphic>
+          </wp:inline>
+        </w:drawing>
+      </w:r>
+    </w:p>
+    <w:p>
+      <w:pPr>
+        <w:jc w:val="center"/>
+      </w:pPr>
+      <w:r>
+        <w:rPr>
+          <w:i/>
+        </w:rPr>
+        <w:t xml:space="preserve">Nota. </w:t>
+      </w:r>
+      <w:r>
+        <w:t>Auditoría propia.</w:t>
+      </w:r>
     </w:p>
     <w:p>
       <w:pPr>
         <w:pStyle w:val="Ttulo1"/>
       </w:pPr>
-      <w:bookmarkStart w:id="25" w:name="_Toc239258955"/>
-      <w:bookmarkStart w:id="26" w:name="resultados"/>
-      <w:bookmarkEnd w:id="17"/>
-      <w:bookmarkEnd w:id="23"/>
+      <w:bookmarkStart w:id="27" w:name="resultados"/>
+      <w:bookmarkStart w:id="28" w:name="_Toc239261504"/>
+      <w:bookmarkEnd w:id="16"/>
+      <w:bookmarkEnd w:id="22"/>
       <w:r>
         <w:t>3. Resultados</w:t>
       </w:r>
-      <w:bookmarkEnd w:id="25"/>
+      <w:bookmarkEnd w:id="28"/>
     </w:p>
     <w:p>
       <w:pPr>
         <w:pStyle w:val="FirstParagraph"/>
       </w:pPr>
       <w:r>
-        <w:t>Etiqueta del taller y evidencia en GitHub: https://github.com/AngelVargasGutierrez/SI-084-TALLER-03/tree/taller-03</w:t>
+        <w:t>Etiqueta del taller y eviden</w:t>
+      </w:r>
+      <w:r>
+        <w:t>cia en GitHub: https://github.com/AngelVargasGutierrez/SI-084-TALLER-03/tree/taller-03</w:t>
       </w:r>
     </w:p>
     <w:tbl>
@@ -2519,10 +3863,10 @@
         <w:tblLook w:val="0020" w:firstRow="1" w:lastRow="0" w:firstColumn="0" w:lastColumn="0" w:noHBand="0" w:noVBand="0"/>
       </w:tblPr>
       <w:tblGrid>
-        <w:gridCol w:w="339"/>
-        <w:gridCol w:w="2854"/>
-        <w:gridCol w:w="1207"/>
-        <w:gridCol w:w="5170"/>
+        <w:gridCol w:w="328"/>
+        <w:gridCol w:w="2590"/>
+        <w:gridCol w:w="952"/>
+        <w:gridCol w:w="5700"/>
       </w:tblGrid>
       <w:tr>
         <w:trPr>
@@ -2602,10 +3946,96 @@
           </w:tcPr>
           <w:p>
             <w:r>
-              <w:t>Greenbone/OpenVAS operativo con feeds sincronizados (o N</w:t>
+              <w:t xml:space="preserve">Greenbone/OpenVAS operativo con feeds sincronizados (o Nuclei como alternativa </w:t>
             </w:r>
             <w:r>
-              <w:t>uclei como alternativa documentada)</w:t>
+              <w:lastRenderedPageBreak/>
+              <w:t>documentada)</w:t>
+            </w:r>
+          </w:p>
+        </w:tc>
+        <w:tc>
+          <w:tcPr>
+            <w:tcW w:w="0" w:type="auto"/>
+          </w:tcPr>
+          <w:p>
+            <w:r>
+              <w:lastRenderedPageBreak/>
+              <w:t>Logrado</w:t>
+            </w:r>
+          </w:p>
+        </w:tc>
+        <w:tc>
+          <w:tcPr>
+            <w:tcW w:w="0" w:type="auto"/>
+          </w:tcPr>
+          <w:p>
+            <w:proofErr w:type="spellStart"/>
+            <w:r>
+              <w:rPr>
+                <w:lang w:val="en-US"/>
+              </w:rPr>
+              <w:t>Interfaz</w:t>
+            </w:r>
+            <w:proofErr w:type="spellEnd"/>
+            <w:r>
+              <w:rPr>
+                <w:lang w:val="en-US"/>
+              </w:rPr>
+              <w:t xml:space="preserve"> </w:t>
+            </w:r>
+            <w:r>
+              <w:rPr>
+                <w:lang w:val="en-US"/>
+              </w:rPr>
+              <w:t xml:space="preserve">https://127.0.0.1/, 186 134 NVT + CVE/SCAP/CERT </w:t>
+            </w:r>
+            <w:proofErr w:type="spellStart"/>
+            <w:r>
+              <w:rPr>
+                <w:lang w:val="en-US"/>
+              </w:rPr>
+              <w:t>sincronizados</w:t>
+            </w:r>
+            <w:proofErr w:type="spellEnd"/>
+            <w:r>
+              <w:rPr>
+                <w:lang w:val="en-US"/>
+              </w:rPr>
+              <w:t xml:space="preserve">. </w:t>
+            </w:r>
+            <w:r>
+              <w:t>Captura: https://github.com/AngelVargasGutierrez/SI-084-TALLER-03/blob/taller-</w:t>
+            </w:r>
+            <w:r>
+              <w:lastRenderedPageBreak/>
+              <w:t>03/docs/evidencias/S03/11_greenbone_dashboard.png</w:t>
+            </w:r>
+          </w:p>
+        </w:tc>
+      </w:tr>
+      <w:tr>
+        <w:tc>
+          <w:tcPr>
+            <w:tcW w:w="0" w:type="auto"/>
+          </w:tcPr>
+          <w:p>
+            <w:pPr>
+              <w:pStyle w:val="Compact"/>
+            </w:pPr>
+            <w:r>
+              <w:lastRenderedPageBreak/>
+              <w:t>2</w:t>
+            </w:r>
+          </w:p>
+        </w:tc>
+        <w:tc>
+          <w:tcPr>
+            <w:tcW w:w="0" w:type="auto"/>
+          </w:tcPr>
+          <w:p>
+            <w:r>
+              <w:t>SimpleRisk configurado con escalas 1-5 con definición operativa escrita y criterio de aceptación</w:t>
             </w:r>
           </w:p>
         </w:tc>
@@ -2625,7 +4055,10 @@
           </w:tcPr>
           <w:p>
             <w:r>
-              <w:t>Interfaz https://127.0.0.1/, 186 134 NVT + CVE/SCAP/CERT sincronizados. Captura: https://github.com/AngelVargasGutierrez/SI-084-TALLER-03/blob/taller-03/docs/evidencias/S03/11_greenbone_dashboard.png</w:t>
+              <w:t>Classic Risk Formula (Likelihood x Impact, 0-10) con definiciones operativas 1-5 y criterio de aceptacion (&lt;=6). Captura: https://github.com/AngelVarga</w:t>
+            </w:r>
+            <w:r>
+              <w:t>sGutierrez/SI-084-TALLER-03/blob/taller-03/docs/evidencias/S03/06_simplerisk_classic_formula.png · Papel de trabajo: https://github.com/AngelVargasGutierrez/SI-084-TALLER-03/blob/taller-03/30_papeles_trabajo/PT03_criterio_evaluacion.md</w:t>
             </w:r>
           </w:p>
         </w:tc>
@@ -2640,7 +4073,7 @@
               <w:pStyle w:val="Compact"/>
             </w:pPr>
             <w:r>
-              <w:t>2</w:t>
+              <w:t>3</w:t>
             </w:r>
           </w:p>
         </w:tc>
@@ -2650,14 +4083,7 @@
           </w:tcPr>
           <w:p>
             <w:r>
-              <w:t xml:space="preserve">SimpleRisk configurado con escalas 1-5 con definición operativa escrita </w:t>
-            </w:r>
-            <w:r>
-              <w:lastRenderedPageBreak/>
-              <w:t>y</w:t>
-            </w:r>
-            <w:r>
-              <w:t xml:space="preserve"> criterio de aceptación</w:t>
+              <w:t>Reporte de escaneo en CSV y XML en E03_scan/, con la lista de objetivos autorizados</w:t>
             </w:r>
           </w:p>
         </w:tc>
@@ -2677,56 +4103,10 @@
           </w:tcPr>
           <w:p>
             <w:r>
-              <w:t>Classic Risk Formula (Likelihood x Impact, 0-10) con definiciones operativas 1-5 y criterio de aceptacion (&lt;=6). Captura: https://github.com/AngelVargasGutierrez/SI-084-TALLER-03/blob/taller-03/docs/evidencias/S03/06_simplerisk_classic_formula.png · Papel de trabajo: https://github.com/AngelVargasGutierrez/SI-084-TALLER-03/blob/taller-03/30_papeles_trabajo/PT03_criterio_evaluacion.md</w:t>
-            </w:r>
-          </w:p>
-        </w:tc>
-      </w:tr>
-      <w:tr>
-        <w:tc>
-          <w:tcPr>
-            <w:tcW w:w="0" w:type="auto"/>
-          </w:tcPr>
-          <w:p>
-            <w:pPr>
-              <w:pStyle w:val="Compact"/>
-            </w:pPr>
-            <w:r>
-              <w:lastRenderedPageBreak/>
-              <w:t>3</w:t>
-            </w:r>
-          </w:p>
-        </w:tc>
-        <w:tc>
-          <w:tcPr>
-            <w:tcW w:w="0" w:type="auto"/>
-          </w:tcPr>
-          <w:p>
-            <w:r>
-              <w:t>Reporte de escaneo en CSV y XML en E03_s</w:t>
+              <w:t>Tarea E03-Escaneo-si084-lab, Done, 107 resultados (61 tras filtro QoD). Reportes y objetivos: https://github.com/AngelVargasGutierrez/SI-084-TALLER-03/blob/taller-03/20_evidencia/E0</w:t>
             </w:r>
             <w:r>
-              <w:t>can/, con la lista de objetivos autorizados</w:t>
-            </w:r>
-          </w:p>
-        </w:tc>
-        <w:tc>
-          <w:tcPr>
-            <w:tcW w:w="0" w:type="auto"/>
-          </w:tcPr>
-          <w:p>
-            <w:r>
-              <w:t>Logrado</w:t>
-            </w:r>
-          </w:p>
-        </w:tc>
-        <w:tc>
-          <w:tcPr>
-            <w:tcW w:w="0" w:type="auto"/>
-          </w:tcPr>
-          <w:p>
-            <w:r>
-              <w:t>Tarea E03-Escaneo-si084-lab, Done, 107 resultados (61 tras filtro QoD). Reportes y objetivos: https://github.com/AngelVargasGutierrez/SI-084-TALLER-03/blob/taller-03/20_evidencia/E03_scan</w:t>
+              <w:t>3_scan</w:t>
             </w:r>
           </w:p>
         </w:tc>
@@ -2751,10 +4131,7 @@
           </w:tcPr>
           <w:p>
             <w:r>
-              <w:t xml:space="preserve">PT03_registro_riesgos.csv con al menos 10 riesgos, cada uno </w:t>
-            </w:r>
-            <w:r>
-              <w:t>con activo, dueño, CVE, probabilidad, impacto y nivel</w:t>
+              <w:t>PT03_registro_riesgos.csv con al menos 10 riesgos, cada uno con activo, dueño, CVE, probabilidad, impacto y nivel</w:t>
             </w:r>
           </w:p>
         </w:tc>
@@ -2774,7 +4151,10 @@
           </w:tcPr>
           <w:p>
             <w:r>
-              <w:t>15 riesgos (min. 10 requerido). Registro: https://github.com/AngelVargasGutierrez/SI-084-TALLER-03/blob/taller-03/40_hallazgos/PT03_registro_riesgos.csv</w:t>
+              <w:t>15 riesgos (min. 10 requerido). Registro: https://github.com/AngelVargasGutierrez/SI-084-TALLER-03/blob/taller-03/40_hallazg</w:t>
+            </w:r>
+            <w:r>
+              <w:t>os/PT03_registro_riesgos.csv</w:t>
             </w:r>
           </w:p>
         </w:tc>
@@ -2799,10 +4179,7 @@
           </w:tcPr>
           <w:p>
             <w:r>
-              <w:t>Dos casos contrastantes documentados: CVSS alto / riesgo bajo y CVSS medio / ries</w:t>
-            </w:r>
-            <w:r>
-              <w:t>go crítico, con la explicación</w:t>
+              <w:t>Dos casos contrastantes documentados: CVSS alto / riesgo bajo y CVSS medio / riesgo crítico, con la explicación</w:t>
             </w:r>
           </w:p>
         </w:tc>
@@ -2822,7 +4199,10 @@
           </w:tcPr>
           <w:p>
             <w:r>
-              <w:t>CVSS 10.0/riesgo Medio (R-011, si084_dvwa) y CVSS bajo-nulo/riesgo Medio (R-006/001/012/007, si084_juiceshop). Detalle: https://github.com/AngelVargasGutierrez/SI-084-TALLER-03/blob/taller-03/30_papeles_trabajo/PT03_criterio_evaluacion.md</w:t>
+              <w:t xml:space="preserve">CVSS 10.0/riesgo Medio (R-011, si084_dvwa) y CVSS bajo-nulo/riesgo Medio (R-006/001/012/007, </w:t>
+            </w:r>
+            <w:r>
+              <w:t>si084_juiceshop). Detalle: https://github.com/AngelVargasGutierrez/SI-084-TALLER-03/blob/taller-03/30_papeles_trabajo/PT03_criterio_evaluacion.md</w:t>
             </w:r>
           </w:p>
         </w:tc>
@@ -2867,7 +4247,13 @@
           </w:tcPr>
           <w:p>
             <w:r>
-              <w:t>5 riesgos (IDs 1001-1005) con plan de mitigacion y control ISO mapeado. Capturas: https://github.com/AngelVargasGutierrez/SI-084-TALLER-03/blob/taller-03/docs/evidencias/S03/09_simplerisk_riesgos_cargados.png y https://github.com/AngelVargasGutierrez/SI-084-TALLER-03/blob/taller-03/docs/evidencias/S03/10_simplerisk_mitigaciones.png</w:t>
+              <w:t>5 riesgos (ID</w:t>
+            </w:r>
+            <w:r>
+              <w:t>s 1001-1005) con plan de mitigacion y control ISO mapeado. Capturas: https://github.com/AngelVargasGutierrez/SI-084-TALLER-03/blob/taller-03/docs/evidencias/S03/09_simplerisk_riesgos_cargados.png y https://github.com/AngelVargasGutierrez/SI-084-TALLER-03/b</w:t>
+            </w:r>
+            <w:r>
+              <w:t>lob/taller-03/docs/evidencias/S03/10_simplerisk_mitigaciones.png</w:t>
             </w:r>
           </w:p>
         </w:tc>
@@ -2912,7 +4298,10 @@
           </w:tcPr>
           <w:p>
             <w:r>
-              <w:t>6 controles, uno excluido (A.7.4) con justificacion. https://github.com/AngelVargasGutierrez/SI-084-TALLER-03/blob/taller-03/30_papeles_trabajo/PT03_soa_extracto.md</w:t>
+              <w:t>6 controles, uno excluido (A.7.4) con justificacion. https://github.com/AngelVargasGutierrez/SI-</w:t>
+            </w:r>
+            <w:r>
+              <w:t>084-TALLER-03/blob/taller-03/30_papeles_trabajo/PT03_soa_extracto.md</w:t>
             </w:r>
           </w:p>
         </w:tc>
@@ -2957,7 +4346,14 @@
           </w:tcPr>
           <w:p>
             <w:r>
-              <w:t>https://github.com/AngelVargasGutierrez/SI-084-TALLER-03/blob/taller-03/20_evidencia/SHA256SUMS_E03.txt · PR: https://github.com/AngelVargasGutierrez/SI-084-TALLER-03/pull/1 (fusionado a develop) · Tag: https://github.com/AngelVargasGutierrez/SI-084-TALLER-03/tree/taller-03</w:t>
+              <w:t>https://github.com/AngelVargasGutierrez/SI-084-TALLER-03/blob/taller-03/20_evidencia/SHA256SUMS_E03.txt · PR: https:</w:t>
+            </w:r>
+            <w:r>
+              <w:t xml:space="preserve">//github.com/AngelVargasGutierrez/SI-084-TALLER-03/pull/1 (fusionado a develop) · Tag: </w:t>
+            </w:r>
+            <w:r>
+              <w:lastRenderedPageBreak/>
+              <w:t>https://github.com/AngelVargasGutierrez/SI-084-TALLER-03/tree/taller-03</w:t>
             </w:r>
           </w:p>
         </w:tc>
@@ -2968,6 +4364,7 @@
         <w:pStyle w:val="Textoindependiente"/>
       </w:pPr>
       <w:r>
+        <w:lastRenderedPageBreak/>
         <w:t>Si algo no se logró, explícalo aquí. Un resultado no alcanzado y bien explicado vale más que uno declarado sin evidencia.</w:t>
       </w:r>
     </w:p>
@@ -2975,13 +4372,13 @@
       <w:pPr>
         <w:pStyle w:val="Ttulo1"/>
       </w:pPr>
-      <w:bookmarkStart w:id="27" w:name="_Toc239258956"/>
-      <w:bookmarkStart w:id="28" w:name="conclusiones"/>
-      <w:bookmarkEnd w:id="26"/>
+      <w:bookmarkStart w:id="29" w:name="conclusiones"/>
+      <w:bookmarkStart w:id="30" w:name="_Toc239261505"/>
+      <w:bookmarkEnd w:id="27"/>
       <w:r>
         <w:t>4. Conclusiones</w:t>
       </w:r>
-      <w:bookmarkEnd w:id="27"/>
+      <w:bookmarkEnd w:id="30"/>
     </w:p>
     <w:p>
       <w:pPr>
@@ -2997,10 +4394,7 @@
         <w:pStyle w:val="FirstParagraph"/>
       </w:pPr>
       <w:r>
-        <w:t>Sin escalas de probabilidad e impacto con definición operativa, y sin un criterio de aceptación aprobado de a</w:t>
-      </w:r>
-      <w:r>
-        <w:t>ntemano (Paso B), la matriz de riesgo produce números que no son comparables entre evaluaciones ni entre evaluadores: dos auditores distintos podrían calificar el mismo hallazgo con valores diferentes si el criterio no está escrito.</w:t>
+        <w:t>Sin escalas de probabilidad e impacto con definición operativa, y sin un criterio de aceptación aprobado de antemano (Paso B), la matriz de riesgo produce números que no son comparables entre evaluaciones ni entre evaluadores: dos auditores distintos podrían calificar el mismo hallazgo con valores diferentes si el criterio no está escrito.</w:t>
       </w:r>
     </w:p>
     <w:p>
@@ -3008,14 +4402,7 @@
         <w:pStyle w:val="FirstParagraph"/>
       </w:pPr>
       <w:r>
-        <w:t>Un stack de escaneo mal</w:t>
-      </w:r>
-      <w:r>
-        <w:t xml:space="preserve"> conectado en red produce un falso 'sin hallazgos' indistinguible de un entorno realmente seguro: la primera ejecución de la tarea en Greenbone terminó en segundos con 0 resultados porque el contenedor escáner no estaba unido a la red audit_net, no porque </w:t>
-      </w:r>
-      <w:r>
-        <w:lastRenderedPageBreak/>
-        <w:t>los activos no tuvieran vulnerabilidades. Verificar la conectividad del escáner hacia el objetivo es, en la práctica, tan importante como configurar bien el propio escaneo.</w:t>
+        <w:t>Un stack de escaneo mal conectado en red produce un falso 'sin hallazgos' indistinguible de un entorno realmente seguro: la primera ejecución de la tarea en Greenbone terminó en segundos con 0 resultados porque el contenedor escáner no estaba unido a la red audit_net, no porque los activos no tuvieran vulnerabilidades. Verificar la conectividad del escáner hacia el objetivo es, en la práctica, tan importante como configurar bien el propio escaneo.</w:t>
       </w:r>
     </w:p>
     <w:p>
@@ -3023,23 +4410,20 @@
         <w:pStyle w:val="FirstParagraph"/>
       </w:pPr>
       <w:r>
-        <w:t xml:space="preserve">La Declaración de Aplicabilidad es el punto donde el análisis de riesgos se vuelve </w:t>
-      </w:r>
-      <w:r>
-        <w:t>auditable: cada control incluido o excluido en el SoA debe poder rastrearse hasta un riesgo concreto del registro, y cada exclusión necesita una justificación explícita, no solo un 'No aplica'.</w:t>
+        <w:t>La Declaración de Aplicabilidad es el punto donde el análisis de riesgos se vuelve auditable: cada control incluido o excluido en el SoA debe poder rastrearse hasta un riesgo concreto del registro, y cada exclusión necesita una justificación explícita, no solo un 'No aplica'.</w:t>
       </w:r>
     </w:p>
     <w:p>
       <w:pPr>
         <w:pStyle w:val="Ttulo1"/>
       </w:pPr>
-      <w:bookmarkStart w:id="29" w:name="_Toc239258957"/>
-      <w:bookmarkStart w:id="30" w:name="cuestionario"/>
-      <w:bookmarkEnd w:id="28"/>
+      <w:bookmarkStart w:id="31" w:name="cuestionario"/>
+      <w:bookmarkStart w:id="32" w:name="_Toc239261506"/>
+      <w:bookmarkEnd w:id="29"/>
       <w:r>
         <w:t>5. Cuestionario</w:t>
       </w:r>
-      <w:bookmarkEnd w:id="29"/>
+      <w:bookmarkEnd w:id="32"/>
     </w:p>
     <w:p>
       <w:pPr>
@@ -3054,13 +4438,13 @@
       <w:pPr>
         <w:pStyle w:val="Ttulo1"/>
       </w:pPr>
-      <w:bookmarkStart w:id="31" w:name="_Toc239258958"/>
-      <w:bookmarkStart w:id="32" w:name="referencias-bibliográficas"/>
-      <w:bookmarkEnd w:id="30"/>
+      <w:bookmarkStart w:id="33" w:name="referencias-bibliográficas"/>
+      <w:bookmarkStart w:id="34" w:name="_Toc239261507"/>
+      <w:bookmarkEnd w:id="31"/>
       <w:r>
         <w:t>6. Referencias bibliográficas</w:t>
       </w:r>
-      <w:bookmarkEnd w:id="31"/>
+      <w:bookmarkEnd w:id="34"/>
     </w:p>
     <w:p>
       <w:pPr>
@@ -3104,13 +4488,7 @@
         <w:rPr>
           <w:lang w:val="en-US"/>
         </w:rPr>
-        <w:t>ISO/IEC 27005:2022. Guidance on managing informati</w:t>
-      </w:r>
-      <w:r>
-        <w:rPr>
-          <w:lang w:val="en-US"/>
-        </w:rPr>
-        <w:t>on security risks. https://www.iso.org/standard/80585.html</w:t>
+        <w:t>ISO/IEC 27005:2022. Guidance on managing information security risks. https://www.iso.org/standard/80585.html</w:t>
       </w:r>
     </w:p>
     <w:p>
@@ -3140,10 +4518,7 @@
         </w:numPr>
       </w:pPr>
       <w:r>
-        <w:t>Resolución de Secretaría de Gobierno y Transformación Digital n.° 003-2023-PCM/SGTD. https://www.gob.pe/institu</w:t>
-      </w:r>
-      <w:r>
-        <w:t>cion/pcm/tema/transformacion-digital/normas-legales</w:t>
+        <w:t>Resolución de Secretaría de Gobierno y Transformación Digital n.° 003-2023-PCM/SGTD. https://www.gob.pe/institucion/pcm/tema/transformacion-digital/normas-legales</w:t>
       </w:r>
     </w:p>
     <w:p>
@@ -3155,6 +4530,7 @@
         </w:numPr>
       </w:pPr>
       <w:r>
+        <w:lastRenderedPageBreak/>
         <w:t>Resolución Ministerial 004-2016-PCM (uso obligatorio de la NTP ISO/IEC 27001 en el Sistema Nacional de Informática). https://www.gob.pe/institucion/pcm/normas-legales/292578-004-2016-pcm</w:t>
       </w:r>
     </w:p>
@@ -3173,13 +4549,7 @@
         <w:rPr>
           <w:lang w:val="en-US"/>
         </w:rPr>
-        <w:t>FIRST. Common Vul</w:t>
-      </w:r>
-      <w:r>
-        <w:rPr>
-          <w:lang w:val="en-US"/>
-        </w:rPr>
-        <w:t>nerability Scoring System v3.1: Specification Document. https://www.first.org/cvss/v3-1/specification-document</w:t>
+        <w:t>FIRST. Common Vulnerability Scoring System v3.1: Specification Document. https://www.first.org/cvss/v3-1/specification-document</w:t>
       </w:r>
     </w:p>
     <w:p>
@@ -3259,13 +4629,7 @@
         <w:rPr>
           <w:lang w:val="en-US"/>
         </w:rPr>
-        <w:t xml:space="preserve"> Documentation. https://www.simplerisk.c</w:t>
-      </w:r>
-      <w:r>
-        <w:rPr>
-          <w:lang w:val="en-US"/>
-        </w:rPr>
-        <w:t>om/documentation</w:t>
+        <w:t xml:space="preserve"> Documentation. https://www.simplerisk.com/documentation</w:t>
       </w:r>
     </w:p>
     <w:p>
@@ -3316,13 +4680,13 @@
       <w:pPr>
         <w:pStyle w:val="Ttulo1"/>
       </w:pPr>
-      <w:bookmarkStart w:id="33" w:name="_Toc239258959"/>
-      <w:bookmarkStart w:id="34" w:name="anexos"/>
-      <w:bookmarkEnd w:id="32"/>
+      <w:bookmarkStart w:id="35" w:name="anexos"/>
+      <w:bookmarkStart w:id="36" w:name="_Toc239261508"/>
+      <w:bookmarkEnd w:id="33"/>
       <w:r>
         <w:t>7. Anexos</w:t>
       </w:r>
-      <w:bookmarkEnd w:id="33"/>
+      <w:bookmarkEnd w:id="36"/>
     </w:p>
     <w:p>
       <w:pPr>
@@ -3330,17 +4694,9 @@
         <w:ind w:left="720"/>
       </w:pPr>
       <w:r>
-        <w:t>Anexo A — Capturas de Greenbone y SimpleRisk. https://github.com/AngelVargasGutierrez/SI-084-TALLER-03/blob/taller-03/docs/evidencias/S03</w:t>
-      </w:r>
-      <w:proofErr w:type="gramStart"/>
-      <w:r>
-        <w:t>/.letra</w:t>
-      </w:r>
-      <w:proofErr w:type="gramEnd"/>
-      <w:r>
-        <w:t xml:space="preserve"> y su título, y se menciona en el cuerpo del informe.</w:t>
-      </w:r>
-      <w:bookmarkEnd w:id="34"/>
+        <w:t>Anexo A — Capturas de Greenbone y SimpleRisk. https://github.com/AngelVargasGutierrez/SI-084-TALLER-03/blob/taller-03/docs/evidencias/S03/.letra y su título, y se menciona en el cuerpo del informe.</w:t>
+      </w:r>
+      <w:bookmarkEnd w:id="35"/>
     </w:p>
     <w:p>
       <w:pPr>
@@ -3355,10 +4711,7 @@
         <w:pStyle w:val="FirstParagraph"/>
       </w:pPr>
       <w:r>
-        <w:t>Anexo C — Extracto de SoA. https://github.com/AngelVargasGutierrez/SI-084-TALLER-03/blob/taller-03/30_papeles_trabajo/PT03_soa_extracto.md</w:t>
-      </w:r>
-      <w:r>
-        <w:t xml:space="preserve"> PT03_soa_extracto.md y capturas de los 5 riesgos cargados en SimpleRisk con su plan de mitigación.</w:t>
+        <w:t>Anexo C — Extracto de SoA. https://github.com/AngelVargasGutierrez/SI-084-TALLER-03/blob/taller-03/30_papeles_trabajo/PT03_soa_extracto.md PT03_soa_extracto.md y capturas de los 5 riesgos cargados en SimpleRisk con su plan de mitigación.</w:t>
       </w:r>
     </w:p>
     <w:p>
@@ -3370,8 +4723,8 @@
       </w:r>
     </w:p>
     <w:sectPr>
-      <w:headerReference w:type="default" r:id="rId10"/>
-      <w:footerReference w:type="default" r:id="rId11"/>
+      <w:headerReference w:type="default" r:id="rId23"/>
+      <w:footerReference w:type="default" r:id="rId24"/>
       <w:footnotePr>
         <w:numRestart w:val="eachSect"/>
       </w:footnotePr>
@@ -3643,7 +4996,7 @@
       <w:lvlText w:val="%1."/>
       <w:lvlJc w:val="left"/>
       <w:pPr>
-        <w:ind w:left="720" w:hanging="360"/>
+        <w:ind w:left="1080" w:hanging="360"/>
       </w:pPr>
     </w:lvl>
     <w:lvl w:ilvl="1">
@@ -3652,7 +5005,7 @@
       <w:lvlText w:val="%2."/>
       <w:lvlJc w:val="left"/>
       <w:pPr>
-        <w:ind w:left="1440" w:hanging="360"/>
+        <w:ind w:left="1800" w:hanging="360"/>
       </w:pPr>
     </w:lvl>
     <w:lvl w:ilvl="2">
@@ -3661,7 +5014,7 @@
       <w:lvlText w:val="%3."/>
       <w:lvlJc w:val="left"/>
       <w:pPr>
-        <w:ind w:left="2160" w:hanging="360"/>
+        <w:ind w:left="2520" w:hanging="360"/>
       </w:pPr>
     </w:lvl>
     <w:lvl w:ilvl="3">
@@ -3670,7 +5023,7 @@
       <w:lvlText w:val="%4."/>
       <w:lvlJc w:val="left"/>
       <w:pPr>
-        <w:ind w:left="2880" w:hanging="360"/>
+        <w:ind w:left="3240" w:hanging="360"/>
       </w:pPr>
     </w:lvl>
     <w:lvl w:ilvl="4">
@@ -3679,7 +5032,7 @@
       <w:lvlText w:val="%5."/>
       <w:lvlJc w:val="left"/>
       <w:pPr>
-        <w:ind w:left="3600" w:hanging="360"/>
+        <w:ind w:left="3960" w:hanging="360"/>
       </w:pPr>
     </w:lvl>
     <w:lvl w:ilvl="5">
@@ -3688,7 +5041,7 @@
       <w:lvlText w:val="%6."/>
       <w:lvlJc w:val="left"/>
       <w:pPr>
-        <w:ind w:left="4320" w:hanging="360"/>
+        <w:ind w:left="4680" w:hanging="360"/>
       </w:pPr>
     </w:lvl>
     <w:lvl w:ilvl="6">
@@ -3697,7 +5050,7 @@
       <w:lvlText w:val="%7."/>
       <w:lvlJc w:val="left"/>
       <w:pPr>
-        <w:ind w:left="5040" w:hanging="360"/>
+        <w:ind w:left="5400" w:hanging="360"/>
       </w:pPr>
     </w:lvl>
     <w:lvl w:ilvl="7">
@@ -3706,7 +5059,7 @@
       <w:lvlText w:val="%8."/>
       <w:lvlJc w:val="left"/>
       <w:pPr>
-        <w:ind w:left="5760" w:hanging="360"/>
+        <w:ind w:left="6120" w:hanging="360"/>
       </w:pPr>
     </w:lvl>
     <w:lvl w:ilvl="8">
@@ -3715,7 +5068,7 @@
       <w:lvlText w:val="%9."/>
       <w:lvlJc w:val="left"/>
       <w:pPr>
-        <w:ind w:left="6480" w:hanging="360"/>
+        <w:ind w:left="6840" w:hanging="360"/>
       </w:pPr>
     </w:lvl>
   </w:abstractNum>

</xml_diff>